<commit_message>
Update lab materials: Modify TK3_De1.docx and enhance tk3.ipynb with detailed statistical analysis and explanations; add tk3.md for comprehensive step-by-step guide on estimation, hypothesis testing, and linear regression.
</commit_message>
<xml_diff>
--- a/iuh/môn/thongKeMT-UngDung/lab/w7/lab9/TK3_De1.docx
+++ b/iuh/môn/thongKeMT-UngDung/lab/w7/lab9/TK3_De1.docx
@@ -1,6 +1,6 @@
 
 <file path=word/document.xml><?xml version="1.0" encoding="utf-8"?>
-<w:document xmlns:wpc="http://schemas.microsoft.com/office/word/2010/wordprocessingCanvas" xmlns:cx="http://schemas.microsoft.com/office/drawing/2014/chartex" xmlns:cx1="http://schemas.microsoft.com/office/drawing/2015/9/8/chartex" xmlns:cx2="http://schemas.microsoft.com/office/drawing/2015/10/21/chartex" xmlns:cx3="http://schemas.microsoft.com/office/drawing/2016/5/9/chartex" xmlns:cx4="http://schemas.microsoft.com/office/drawing/2016/5/10/chartex" xmlns:cx5="http://schemas.microsoft.com/office/drawing/2016/5/11/chartex" xmlns:cx6="http://schemas.microsoft.com/office/drawing/2016/5/12/chartex" xmlns:cx7="http://schemas.microsoft.com/office/drawing/2016/5/13/chartex" xmlns:cx8="http://schemas.microsoft.com/office/drawing/2016/5/14/chartex" xmlns:mc="http://schemas.openxmlformats.org/markup-compatibility/2006" xmlns:aink="http://schemas.microsoft.com/office/drawing/2016/ink" xmlns:am3d="http://schemas.microsoft.com/office/drawing/2017/model3d" xmlns:o="urn:schemas-microsoft-com:office:office" xmlns:oel="http://schemas.microsoft.com/office/2019/extlst" xmlns:r="http://schemas.openxmlformats.org/officeDocument/2006/relationships" xmlns:m="http://schemas.openxmlformats.org/officeDocument/2006/math" xmlns:v="urn:schemas-microsoft-com:vml" xmlns:wp14="http://schemas.microsoft.com/office/word/2010/wordprocessingDrawing" xmlns:wp="http://schemas.openxmlformats.org/drawingml/2006/wordprocessingDrawing" xmlns:w10="urn:schemas-microsoft-com:office:word" xmlns:w="http://schemas.openxmlformats.org/wordprocessingml/2006/main" xmlns:w14="http://schemas.microsoft.com/office/word/2010/wordml" xmlns:w15="http://schemas.microsoft.com/office/word/2012/wordml" xmlns:w16cex="http://schemas.microsoft.com/office/word/2018/wordml/cex" xmlns:w16cid="http://schemas.microsoft.com/office/word/2016/wordml/cid" xmlns:w16="http://schemas.microsoft.com/office/word/2018/wordml" xmlns:w16du="http://schemas.microsoft.com/office/word/2023/wordml/word16du" xmlns:w16sdtdh="http://schemas.microsoft.com/office/word/2020/wordml/sdtdatahash" xmlns:w16sdtfl="http://schemas.microsoft.com/office/word/2024/wordml/sdtformatlock" xmlns:w16se="http://schemas.microsoft.com/office/word/2015/wordml/symex" xmlns:wpg="http://schemas.microsoft.com/office/word/2010/wordprocessingGroup" xmlns:wpi="http://schemas.microsoft.com/office/word/2010/wordprocessingInk" xmlns:wne="http://schemas.microsoft.com/office/word/2006/wordml" xmlns:wps="http://schemas.microsoft.com/office/word/2010/wordprocessingShape" mc:Ignorable="w14 w15 w16se w16cid w16 w16cex w16sdtdh w16sdtfl w16du wp14">
+<w:document xmlns:wpc="http://schemas.microsoft.com/office/word/2010/wordprocessingCanvas" xmlns:mc="http://schemas.openxmlformats.org/markup-compatibility/2006" xmlns:o="urn:schemas-microsoft-com:office:office" xmlns:r="http://schemas.openxmlformats.org/officeDocument/2006/relationships" xmlns:m="http://schemas.openxmlformats.org/officeDocument/2006/math" xmlns:v="urn:schemas-microsoft-com:vml" xmlns:wp14="http://schemas.microsoft.com/office/word/2010/wordprocessingDrawing" xmlns:wp="http://schemas.openxmlformats.org/drawingml/2006/wordprocessingDrawing" xmlns:w10="urn:schemas-microsoft-com:office:word" xmlns:w="http://schemas.openxmlformats.org/wordprocessingml/2006/main" xmlns:w14="http://schemas.microsoft.com/office/word/2010/wordml" xmlns:w15="http://schemas.microsoft.com/office/word/2012/wordml" xmlns:wpg="http://schemas.microsoft.com/office/word/2010/wordprocessingGroup" xmlns:wpi="http://schemas.microsoft.com/office/word/2010/wordprocessingInk" xmlns:wne="http://schemas.microsoft.com/office/word/2006/wordml" xmlns:wps="http://schemas.microsoft.com/office/word/2010/wordprocessingShape" mc:Ignorable="w14 w15 wp14">
   <w:body>
     <w:p>
       <w:pPr>
@@ -91,20 +91,28 @@
       <w:tblPr>
         <w:tblW w:w="7100" w:type="dxa"/>
         <w:jc w:val="center"/>
+        <w:tblBorders>
+          <w:top w:val="single" w:sz="4" w:space="0" w:color="auto"/>
+          <w:left w:val="single" w:sz="4" w:space="0" w:color="auto"/>
+          <w:bottom w:val="single" w:sz="4" w:space="0" w:color="auto"/>
+          <w:right w:val="single" w:sz="4" w:space="0" w:color="auto"/>
+          <w:insideH w:val="single" w:sz="4" w:space="0" w:color="auto"/>
+          <w:insideV w:val="single" w:sz="4" w:space="0" w:color="auto"/>
+        </w:tblBorders>
         <w:tblLook w:val="04A0" w:firstRow="1" w:lastRow="0" w:firstColumn="1" w:lastColumn="0" w:noHBand="0" w:noVBand="1"/>
       </w:tblPr>
       <w:tblGrid>
         <w:gridCol w:w="1300"/>
-        <w:gridCol w:w="644"/>
-        <w:gridCol w:w="644"/>
-        <w:gridCol w:w="644"/>
-        <w:gridCol w:w="644"/>
-        <w:gridCol w:w="644"/>
-        <w:gridCol w:w="644"/>
-        <w:gridCol w:w="644"/>
-        <w:gridCol w:w="644"/>
-        <w:gridCol w:w="644"/>
-        <w:gridCol w:w="644"/>
+        <w:gridCol w:w="684"/>
+        <w:gridCol w:w="684"/>
+        <w:gridCol w:w="684"/>
+        <w:gridCol w:w="684"/>
+        <w:gridCol w:w="684"/>
+        <w:gridCol w:w="684"/>
+        <w:gridCol w:w="684"/>
+        <w:gridCol w:w="684"/>
+        <w:gridCol w:w="684"/>
+        <w:gridCol w:w="684"/>
       </w:tblGrid>
       <w:tr>
         <w:trPr>
@@ -114,12 +122,6 @@
         <w:tc>
           <w:tcPr>
             <w:tcW w:w="1300" w:type="dxa"/>
-            <w:tcBorders>
-              <w:top w:val="nil"/>
-              <w:left w:val="nil"/>
-              <w:bottom w:val="nil"/>
-              <w:right w:val="nil"/>
-            </w:tcBorders>
             <w:noWrap/>
             <w:vAlign w:val="bottom"/>
             <w:hideMark/>
@@ -135,12 +137,6 @@
         <w:tc>
           <w:tcPr>
             <w:tcW w:w="580" w:type="dxa"/>
-            <w:tcBorders>
-              <w:top w:val="nil"/>
-              <w:left w:val="nil"/>
-              <w:bottom w:val="nil"/>
-              <w:right w:val="nil"/>
-            </w:tcBorders>
             <w:noWrap/>
             <w:vAlign w:val="bottom"/>
             <w:hideMark/>
@@ -169,12 +165,6 @@
         <w:tc>
           <w:tcPr>
             <w:tcW w:w="580" w:type="dxa"/>
-            <w:tcBorders>
-              <w:top w:val="nil"/>
-              <w:left w:val="nil"/>
-              <w:bottom w:val="nil"/>
-              <w:right w:val="nil"/>
-            </w:tcBorders>
             <w:noWrap/>
             <w:vAlign w:val="bottom"/>
             <w:hideMark/>
@@ -203,12 +193,6 @@
         <w:tc>
           <w:tcPr>
             <w:tcW w:w="580" w:type="dxa"/>
-            <w:tcBorders>
-              <w:top w:val="nil"/>
-              <w:left w:val="nil"/>
-              <w:bottom w:val="nil"/>
-              <w:right w:val="nil"/>
-            </w:tcBorders>
             <w:noWrap/>
             <w:vAlign w:val="bottom"/>
             <w:hideMark/>
@@ -237,12 +221,6 @@
         <w:tc>
           <w:tcPr>
             <w:tcW w:w="580" w:type="dxa"/>
-            <w:tcBorders>
-              <w:top w:val="nil"/>
-              <w:left w:val="nil"/>
-              <w:bottom w:val="nil"/>
-              <w:right w:val="nil"/>
-            </w:tcBorders>
             <w:noWrap/>
             <w:vAlign w:val="bottom"/>
             <w:hideMark/>
@@ -271,12 +249,6 @@
         <w:tc>
           <w:tcPr>
             <w:tcW w:w="580" w:type="dxa"/>
-            <w:tcBorders>
-              <w:top w:val="nil"/>
-              <w:left w:val="nil"/>
-              <w:bottom w:val="nil"/>
-              <w:right w:val="nil"/>
-            </w:tcBorders>
             <w:noWrap/>
             <w:vAlign w:val="bottom"/>
             <w:hideMark/>
@@ -305,12 +277,6 @@
         <w:tc>
           <w:tcPr>
             <w:tcW w:w="580" w:type="dxa"/>
-            <w:tcBorders>
-              <w:top w:val="nil"/>
-              <w:left w:val="nil"/>
-              <w:bottom w:val="nil"/>
-              <w:right w:val="nil"/>
-            </w:tcBorders>
             <w:noWrap/>
             <w:vAlign w:val="bottom"/>
             <w:hideMark/>
@@ -339,12 +305,6 @@
         <w:tc>
           <w:tcPr>
             <w:tcW w:w="580" w:type="dxa"/>
-            <w:tcBorders>
-              <w:top w:val="nil"/>
-              <w:left w:val="nil"/>
-              <w:bottom w:val="nil"/>
-              <w:right w:val="nil"/>
-            </w:tcBorders>
             <w:noWrap/>
             <w:vAlign w:val="bottom"/>
             <w:hideMark/>
@@ -373,12 +333,6 @@
         <w:tc>
           <w:tcPr>
             <w:tcW w:w="580" w:type="dxa"/>
-            <w:tcBorders>
-              <w:top w:val="nil"/>
-              <w:left w:val="nil"/>
-              <w:bottom w:val="nil"/>
-              <w:right w:val="nil"/>
-            </w:tcBorders>
             <w:noWrap/>
             <w:vAlign w:val="bottom"/>
             <w:hideMark/>
@@ -407,12 +361,6 @@
         <w:tc>
           <w:tcPr>
             <w:tcW w:w="580" w:type="dxa"/>
-            <w:tcBorders>
-              <w:top w:val="nil"/>
-              <w:left w:val="nil"/>
-              <w:bottom w:val="nil"/>
-              <w:right w:val="nil"/>
-            </w:tcBorders>
             <w:noWrap/>
             <w:vAlign w:val="bottom"/>
             <w:hideMark/>
@@ -441,12 +389,6 @@
         <w:tc>
           <w:tcPr>
             <w:tcW w:w="580" w:type="dxa"/>
-            <w:tcBorders>
-              <w:top w:val="nil"/>
-              <w:left w:val="nil"/>
-              <w:bottom w:val="nil"/>
-              <w:right w:val="nil"/>
-            </w:tcBorders>
             <w:noWrap/>
             <w:vAlign w:val="bottom"/>
             <w:hideMark/>
@@ -481,12 +423,6 @@
         <w:tc>
           <w:tcPr>
             <w:tcW w:w="1300" w:type="dxa"/>
-            <w:tcBorders>
-              <w:top w:val="nil"/>
-              <w:left w:val="nil"/>
-              <w:bottom w:val="nil"/>
-              <w:right w:val="nil"/>
-            </w:tcBorders>
             <w:noWrap/>
             <w:vAlign w:val="bottom"/>
             <w:hideMark/>
@@ -514,12 +450,6 @@
         <w:tc>
           <w:tcPr>
             <w:tcW w:w="580" w:type="dxa"/>
-            <w:tcBorders>
-              <w:top w:val="nil"/>
-              <w:left w:val="nil"/>
-              <w:bottom w:val="nil"/>
-              <w:right w:val="nil"/>
-            </w:tcBorders>
             <w:noWrap/>
             <w:vAlign w:val="bottom"/>
             <w:hideMark/>
@@ -544,12 +474,6 @@
         <w:tc>
           <w:tcPr>
             <w:tcW w:w="580" w:type="dxa"/>
-            <w:tcBorders>
-              <w:top w:val="nil"/>
-              <w:left w:val="nil"/>
-              <w:bottom w:val="nil"/>
-              <w:right w:val="nil"/>
-            </w:tcBorders>
             <w:noWrap/>
             <w:vAlign w:val="bottom"/>
             <w:hideMark/>
@@ -574,12 +498,6 @@
         <w:tc>
           <w:tcPr>
             <w:tcW w:w="580" w:type="dxa"/>
-            <w:tcBorders>
-              <w:top w:val="nil"/>
-              <w:left w:val="nil"/>
-              <w:bottom w:val="nil"/>
-              <w:right w:val="nil"/>
-            </w:tcBorders>
             <w:noWrap/>
             <w:vAlign w:val="bottom"/>
             <w:hideMark/>
@@ -604,12 +522,6 @@
         <w:tc>
           <w:tcPr>
             <w:tcW w:w="580" w:type="dxa"/>
-            <w:tcBorders>
-              <w:top w:val="nil"/>
-              <w:left w:val="nil"/>
-              <w:bottom w:val="nil"/>
-              <w:right w:val="nil"/>
-            </w:tcBorders>
             <w:noWrap/>
             <w:vAlign w:val="bottom"/>
             <w:hideMark/>
@@ -634,12 +546,6 @@
         <w:tc>
           <w:tcPr>
             <w:tcW w:w="580" w:type="dxa"/>
-            <w:tcBorders>
-              <w:top w:val="nil"/>
-              <w:left w:val="nil"/>
-              <w:bottom w:val="nil"/>
-              <w:right w:val="nil"/>
-            </w:tcBorders>
             <w:noWrap/>
             <w:vAlign w:val="bottom"/>
             <w:hideMark/>
@@ -664,12 +570,6 @@
         <w:tc>
           <w:tcPr>
             <w:tcW w:w="580" w:type="dxa"/>
-            <w:tcBorders>
-              <w:top w:val="nil"/>
-              <w:left w:val="nil"/>
-              <w:bottom w:val="nil"/>
-              <w:right w:val="nil"/>
-            </w:tcBorders>
             <w:noWrap/>
             <w:vAlign w:val="bottom"/>
             <w:hideMark/>
@@ -694,12 +594,6 @@
         <w:tc>
           <w:tcPr>
             <w:tcW w:w="580" w:type="dxa"/>
-            <w:tcBorders>
-              <w:top w:val="nil"/>
-              <w:left w:val="nil"/>
-              <w:bottom w:val="nil"/>
-              <w:right w:val="nil"/>
-            </w:tcBorders>
             <w:noWrap/>
             <w:vAlign w:val="bottom"/>
             <w:hideMark/>
@@ -724,12 +618,6 @@
         <w:tc>
           <w:tcPr>
             <w:tcW w:w="580" w:type="dxa"/>
-            <w:tcBorders>
-              <w:top w:val="nil"/>
-              <w:left w:val="nil"/>
-              <w:bottom w:val="nil"/>
-              <w:right w:val="nil"/>
-            </w:tcBorders>
             <w:noWrap/>
             <w:vAlign w:val="bottom"/>
             <w:hideMark/>
@@ -754,12 +642,6 @@
         <w:tc>
           <w:tcPr>
             <w:tcW w:w="580" w:type="dxa"/>
-            <w:tcBorders>
-              <w:top w:val="nil"/>
-              <w:left w:val="nil"/>
-              <w:bottom w:val="nil"/>
-              <w:right w:val="nil"/>
-            </w:tcBorders>
             <w:noWrap/>
             <w:vAlign w:val="bottom"/>
             <w:hideMark/>
@@ -784,12 +666,6 @@
         <w:tc>
           <w:tcPr>
             <w:tcW w:w="580" w:type="dxa"/>
-            <w:tcBorders>
-              <w:top w:val="nil"/>
-              <w:left w:val="nil"/>
-              <w:bottom w:val="nil"/>
-              <w:right w:val="nil"/>
-            </w:tcBorders>
             <w:noWrap/>
             <w:vAlign w:val="bottom"/>
             <w:hideMark/>
@@ -820,12 +696,6 @@
         <w:tc>
           <w:tcPr>
             <w:tcW w:w="1300" w:type="dxa"/>
-            <w:tcBorders>
-              <w:top w:val="nil"/>
-              <w:left w:val="nil"/>
-              <w:bottom w:val="nil"/>
-              <w:right w:val="nil"/>
-            </w:tcBorders>
             <w:noWrap/>
             <w:vAlign w:val="bottom"/>
             <w:hideMark/>
@@ -853,12 +723,6 @@
         <w:tc>
           <w:tcPr>
             <w:tcW w:w="580" w:type="dxa"/>
-            <w:tcBorders>
-              <w:top w:val="nil"/>
-              <w:left w:val="nil"/>
-              <w:bottom w:val="nil"/>
-              <w:right w:val="nil"/>
-            </w:tcBorders>
             <w:noWrap/>
             <w:vAlign w:val="bottom"/>
             <w:hideMark/>
@@ -883,12 +747,6 @@
         <w:tc>
           <w:tcPr>
             <w:tcW w:w="580" w:type="dxa"/>
-            <w:tcBorders>
-              <w:top w:val="nil"/>
-              <w:left w:val="nil"/>
-              <w:bottom w:val="nil"/>
-              <w:right w:val="nil"/>
-            </w:tcBorders>
             <w:noWrap/>
             <w:vAlign w:val="bottom"/>
             <w:hideMark/>
@@ -913,12 +771,6 @@
         <w:tc>
           <w:tcPr>
             <w:tcW w:w="580" w:type="dxa"/>
-            <w:tcBorders>
-              <w:top w:val="nil"/>
-              <w:left w:val="nil"/>
-              <w:bottom w:val="nil"/>
-              <w:right w:val="nil"/>
-            </w:tcBorders>
             <w:noWrap/>
             <w:vAlign w:val="bottom"/>
             <w:hideMark/>
@@ -943,12 +795,6 @@
         <w:tc>
           <w:tcPr>
             <w:tcW w:w="580" w:type="dxa"/>
-            <w:tcBorders>
-              <w:top w:val="nil"/>
-              <w:left w:val="nil"/>
-              <w:bottom w:val="nil"/>
-              <w:right w:val="nil"/>
-            </w:tcBorders>
             <w:noWrap/>
             <w:vAlign w:val="bottom"/>
             <w:hideMark/>
@@ -973,12 +819,6 @@
         <w:tc>
           <w:tcPr>
             <w:tcW w:w="580" w:type="dxa"/>
-            <w:tcBorders>
-              <w:top w:val="nil"/>
-              <w:left w:val="nil"/>
-              <w:bottom w:val="nil"/>
-              <w:right w:val="nil"/>
-            </w:tcBorders>
             <w:noWrap/>
             <w:vAlign w:val="bottom"/>
             <w:hideMark/>
@@ -1003,12 +843,6 @@
         <w:tc>
           <w:tcPr>
             <w:tcW w:w="580" w:type="dxa"/>
-            <w:tcBorders>
-              <w:top w:val="nil"/>
-              <w:left w:val="nil"/>
-              <w:bottom w:val="nil"/>
-              <w:right w:val="nil"/>
-            </w:tcBorders>
             <w:noWrap/>
             <w:vAlign w:val="bottom"/>
             <w:hideMark/>
@@ -1033,12 +867,6 @@
         <w:tc>
           <w:tcPr>
             <w:tcW w:w="580" w:type="dxa"/>
-            <w:tcBorders>
-              <w:top w:val="nil"/>
-              <w:left w:val="nil"/>
-              <w:bottom w:val="nil"/>
-              <w:right w:val="nil"/>
-            </w:tcBorders>
             <w:noWrap/>
             <w:vAlign w:val="bottom"/>
             <w:hideMark/>
@@ -1063,12 +891,6 @@
         <w:tc>
           <w:tcPr>
             <w:tcW w:w="580" w:type="dxa"/>
-            <w:tcBorders>
-              <w:top w:val="nil"/>
-              <w:left w:val="nil"/>
-              <w:bottom w:val="nil"/>
-              <w:right w:val="nil"/>
-            </w:tcBorders>
             <w:noWrap/>
             <w:vAlign w:val="bottom"/>
             <w:hideMark/>
@@ -1093,12 +915,6 @@
         <w:tc>
           <w:tcPr>
             <w:tcW w:w="580" w:type="dxa"/>
-            <w:tcBorders>
-              <w:top w:val="nil"/>
-              <w:left w:val="nil"/>
-              <w:bottom w:val="nil"/>
-              <w:right w:val="nil"/>
-            </w:tcBorders>
             <w:noWrap/>
             <w:vAlign w:val="bottom"/>
             <w:hideMark/>
@@ -1123,12 +939,6 @@
         <w:tc>
           <w:tcPr>
             <w:tcW w:w="580" w:type="dxa"/>
-            <w:tcBorders>
-              <w:top w:val="nil"/>
-              <w:left w:val="nil"/>
-              <w:bottom w:val="nil"/>
-              <w:right w:val="nil"/>
-            </w:tcBorders>
             <w:noWrap/>
             <w:vAlign w:val="bottom"/>
             <w:hideMark/>
@@ -1159,12 +969,6 @@
         <w:tc>
           <w:tcPr>
             <w:tcW w:w="1300" w:type="dxa"/>
-            <w:tcBorders>
-              <w:top w:val="nil"/>
-              <w:left w:val="nil"/>
-              <w:bottom w:val="nil"/>
-              <w:right w:val="nil"/>
-            </w:tcBorders>
             <w:noWrap/>
             <w:vAlign w:val="bottom"/>
             <w:hideMark/>
@@ -1192,12 +996,6 @@
         <w:tc>
           <w:tcPr>
             <w:tcW w:w="580" w:type="dxa"/>
-            <w:tcBorders>
-              <w:top w:val="nil"/>
-              <w:left w:val="nil"/>
-              <w:bottom w:val="nil"/>
-              <w:right w:val="nil"/>
-            </w:tcBorders>
             <w:noWrap/>
             <w:vAlign w:val="bottom"/>
             <w:hideMark/>
@@ -1222,12 +1020,6 @@
         <w:tc>
           <w:tcPr>
             <w:tcW w:w="580" w:type="dxa"/>
-            <w:tcBorders>
-              <w:top w:val="nil"/>
-              <w:left w:val="nil"/>
-              <w:bottom w:val="nil"/>
-              <w:right w:val="nil"/>
-            </w:tcBorders>
             <w:noWrap/>
             <w:vAlign w:val="bottom"/>
             <w:hideMark/>
@@ -1252,12 +1044,6 @@
         <w:tc>
           <w:tcPr>
             <w:tcW w:w="580" w:type="dxa"/>
-            <w:tcBorders>
-              <w:top w:val="nil"/>
-              <w:left w:val="nil"/>
-              <w:bottom w:val="nil"/>
-              <w:right w:val="nil"/>
-            </w:tcBorders>
             <w:noWrap/>
             <w:vAlign w:val="bottom"/>
             <w:hideMark/>
@@ -1282,12 +1068,6 @@
         <w:tc>
           <w:tcPr>
             <w:tcW w:w="580" w:type="dxa"/>
-            <w:tcBorders>
-              <w:top w:val="nil"/>
-              <w:left w:val="nil"/>
-              <w:bottom w:val="nil"/>
-              <w:right w:val="nil"/>
-            </w:tcBorders>
             <w:noWrap/>
             <w:vAlign w:val="bottom"/>
             <w:hideMark/>
@@ -1312,12 +1092,6 @@
         <w:tc>
           <w:tcPr>
             <w:tcW w:w="580" w:type="dxa"/>
-            <w:tcBorders>
-              <w:top w:val="nil"/>
-              <w:left w:val="nil"/>
-              <w:bottom w:val="nil"/>
-              <w:right w:val="nil"/>
-            </w:tcBorders>
             <w:noWrap/>
             <w:vAlign w:val="bottom"/>
             <w:hideMark/>
@@ -1342,12 +1116,6 @@
         <w:tc>
           <w:tcPr>
             <w:tcW w:w="580" w:type="dxa"/>
-            <w:tcBorders>
-              <w:top w:val="nil"/>
-              <w:left w:val="nil"/>
-              <w:bottom w:val="nil"/>
-              <w:right w:val="nil"/>
-            </w:tcBorders>
             <w:noWrap/>
             <w:vAlign w:val="bottom"/>
             <w:hideMark/>
@@ -1372,12 +1140,6 @@
         <w:tc>
           <w:tcPr>
             <w:tcW w:w="580" w:type="dxa"/>
-            <w:tcBorders>
-              <w:top w:val="nil"/>
-              <w:left w:val="nil"/>
-              <w:bottom w:val="nil"/>
-              <w:right w:val="nil"/>
-            </w:tcBorders>
             <w:noWrap/>
             <w:vAlign w:val="bottom"/>
             <w:hideMark/>
@@ -1402,12 +1164,6 @@
         <w:tc>
           <w:tcPr>
             <w:tcW w:w="580" w:type="dxa"/>
-            <w:tcBorders>
-              <w:top w:val="nil"/>
-              <w:left w:val="nil"/>
-              <w:bottom w:val="nil"/>
-              <w:right w:val="nil"/>
-            </w:tcBorders>
             <w:noWrap/>
             <w:vAlign w:val="bottom"/>
             <w:hideMark/>
@@ -1432,12 +1188,6 @@
         <w:tc>
           <w:tcPr>
             <w:tcW w:w="580" w:type="dxa"/>
-            <w:tcBorders>
-              <w:top w:val="nil"/>
-              <w:left w:val="nil"/>
-              <w:bottom w:val="nil"/>
-              <w:right w:val="nil"/>
-            </w:tcBorders>
             <w:noWrap/>
             <w:vAlign w:val="bottom"/>
             <w:hideMark/>
@@ -1462,12 +1212,6 @@
         <w:tc>
           <w:tcPr>
             <w:tcW w:w="580" w:type="dxa"/>
-            <w:tcBorders>
-              <w:top w:val="nil"/>
-              <w:left w:val="nil"/>
-              <w:bottom w:val="nil"/>
-              <w:right w:val="nil"/>
-            </w:tcBorders>
             <w:noWrap/>
             <w:vAlign w:val="bottom"/>
             <w:hideMark/>
@@ -1508,7 +1252,6 @@
       <w:r>
         <w:rPr>
           <w:szCs w:val="24"/>
-          <w:lang w:val="en-VN"/>
         </w:rPr>
         <w:t>Với dữ liệu mpg khi lái xe trong điều kiện cao tốc, hãy tính</w:t>
       </w:r>
@@ -1522,7 +1265,6 @@
       <w:r>
         <w:rPr>
           <w:szCs w:val="24"/>
-          <w:lang w:val="en-VN"/>
         </w:rPr>
         <w:t xml:space="preserve"> độ lệch chuẩn của trung bình mẫu</w:t>
       </w:r>
@@ -1560,7 +1302,6 @@
       <w:r>
         <w:rPr>
           <w:szCs w:val="24"/>
-          <w:lang w:val="en-VN"/>
         </w:rPr>
         <w:t>Với độ tin cậy 99%, hãy tìm khoảng ước lượng cho giá trị trung bình mpg trong điều kiện hỗn hợp</w:t>
       </w:r>
@@ -1598,7 +1339,6 @@
       <w:r>
         <w:rPr>
           <w:szCs w:val="24"/>
-          <w:lang w:val="en-VN"/>
         </w:rPr>
         <w:t>Giả sử mỗi giá trị mpg lớn hơn hoặc bằng 45 được xem là “hiệu suất cao”. Với dữ liệu trong điều kiện hỗn hợp, hãy tìm khoảng ước lượng 95% cho tỷ lệ phương tiện có hiệu suất cao</w:t>
       </w:r>
@@ -1739,7 +1479,6 @@
         <w:rPr>
           <w:bCs/>
           <w:noProof/>
-          <w:lang w:val="vi-VN"/>
         </w:rPr>
         <w:drawing>
           <wp:inline distT="0" distB="0" distL="0" distR="0" wp14:anchorId="3C5563B0" wp14:editId="64B0E920">
@@ -1865,16 +1604,16 @@
       </w:tblPr>
       <w:tblGrid>
         <w:gridCol w:w="1701"/>
-        <w:gridCol w:w="581"/>
-        <w:gridCol w:w="581"/>
-        <w:gridCol w:w="581"/>
-        <w:gridCol w:w="581"/>
-        <w:gridCol w:w="581"/>
-        <w:gridCol w:w="581"/>
-        <w:gridCol w:w="581"/>
-        <w:gridCol w:w="581"/>
-        <w:gridCol w:w="581"/>
-        <w:gridCol w:w="581"/>
+        <w:gridCol w:w="617"/>
+        <w:gridCol w:w="617"/>
+        <w:gridCol w:w="617"/>
+        <w:gridCol w:w="617"/>
+        <w:gridCol w:w="617"/>
+        <w:gridCol w:w="617"/>
+        <w:gridCol w:w="617"/>
+        <w:gridCol w:w="617"/>
+        <w:gridCol w:w="617"/>
+        <w:gridCol w:w="617"/>
       </w:tblGrid>
       <w:tr>
         <w:trPr>
@@ -2583,23 +2322,14 @@
         <w:jc w:val="left"/>
         <w:rPr>
           <w:szCs w:val="24"/>
-          <w:lang w:val="en-VN"/>
         </w:rPr>
       </w:pPr>
       <w:r>
         <w:rPr>
           <w:szCs w:val="24"/>
-          <w:lang w:val="en-VN"/>
-        </w:rPr>
-        <w:t xml:space="preserve">Một khảo sát được thực hiện để kiểm tra xem tỷ lệ người dùng sử dụng điện thoại thông minh để mua sắm online có vượt quá 60% hay không. Khảo sát được thực hiện </w:t>
-      </w:r>
-      <w:r>
-        <w:rPr>
-          <w:szCs w:val="24"/>
-          <w:lang w:val="en-VN"/>
         </w:rPr>
         <w:lastRenderedPageBreak/>
-        <w:t>với 100 người, trong đó có 68 người cho biết họ thường xuyên mua hàng online qua điện thoại. Với mức ý nghĩa 5%, hãy kiểm định giả thuyết rằng tỷ lệ người sử dụng điện thoại để mua sắm online vượt quá 60%</w:t>
+        <w:t>Một khảo sát được thực hiện để kiểm tra xem tỷ lệ người dùng sử dụng điện thoại thông minh để mua sắm online có vượt quá 60% hay không. Khảo sát được thực hiện với 100 người, trong đó có 68 người cho biết họ thường xuyên mua hàng online qua điện thoại. Với mức ý nghĩa 5%, hãy kiểm định giả thuyết rằng tỷ lệ người sử dụng điện thoại để mua sắm online vượt quá 60%</w:t>
       </w:r>
       <w:r>
         <w:rPr>
@@ -2749,7 +2479,12 @@
         <w:t xml:space="preserve"> (y)</w:t>
       </w:r>
       <w:r>
-        <w:t xml:space="preserve"> của 10 học sinh. Dữ liệu thu được như sau:</w:t>
+        <w:t xml:space="preserve"> của 10 học sinh. Dữ </w:t>
+      </w:r>
+      <w:bookmarkStart w:id="0" w:name="_GoBack"/>
+      <w:bookmarkEnd w:id="0"/>
+      <w:r>
+        <w:t>liệu thu được như sau:</w:t>
       </w:r>
     </w:p>
     <w:tbl>
@@ -2759,17 +2494,17 @@
         <w:tblLook w:val="04A0" w:firstRow="1" w:lastRow="0" w:firstColumn="1" w:lastColumn="0" w:noHBand="0" w:noVBand="1"/>
       </w:tblPr>
       <w:tblGrid>
-        <w:gridCol w:w="316"/>
-        <w:gridCol w:w="522"/>
-        <w:gridCol w:w="522"/>
-        <w:gridCol w:w="522"/>
-        <w:gridCol w:w="522"/>
-        <w:gridCol w:w="522"/>
-        <w:gridCol w:w="522"/>
-        <w:gridCol w:w="522"/>
-        <w:gridCol w:w="522"/>
-        <w:gridCol w:w="522"/>
-        <w:gridCol w:w="522"/>
+        <w:gridCol w:w="336"/>
+        <w:gridCol w:w="550"/>
+        <w:gridCol w:w="550"/>
+        <w:gridCol w:w="550"/>
+        <w:gridCol w:w="550"/>
+        <w:gridCol w:w="550"/>
+        <w:gridCol w:w="550"/>
+        <w:gridCol w:w="550"/>
+        <w:gridCol w:w="550"/>
+        <w:gridCol w:w="550"/>
+        <w:gridCol w:w="550"/>
       </w:tblGrid>
       <w:tr>
         <w:trPr>
@@ -3556,8 +3291,2043 @@
         <w:t>(1 điểm).</w:t>
       </w:r>
     </w:p>
+    <w:p>
+      <w:pPr>
+        <w:pStyle w:val="Heading3"/>
+        <w:rPr>
+          <w:b w:val="0"/>
+          <w:bCs w:val="0"/>
+          <w:i/>
+          <w:iCs/>
+          <w:szCs w:val="24"/>
+          <w:lang w:val="vi-VN"/>
+        </w:rPr>
+      </w:pPr>
+    </w:p>
+    <w:p>
+      <w:pPr>
+        <w:pStyle w:val="Heading3"/>
+        <w:rPr>
+          <w:b w:val="0"/>
+          <w:bCs w:val="0"/>
+          <w:i/>
+          <w:iCs/>
+          <w:szCs w:val="24"/>
+          <w:lang w:val="vi-VN"/>
+        </w:rPr>
+      </w:pPr>
+    </w:p>
+    <w:p>
+      <w:pPr>
+        <w:pStyle w:val="Heading1"/>
+      </w:pPr>
+      <w:bookmarkStart w:id="1" w:name="câu-1-ước-lượng-trung-bình-và-tỷ-lệ"/>
+      <w:r>
+        <w:rPr>
+          <w:rFonts w:ascii="Calibri Light" w:hAnsi="Calibri Light" w:cs="Calibri Light"/>
+        </w:rPr>
+        <w:t>🧮</w:t>
+      </w:r>
+      <w:r>
+        <w:t xml:space="preserve"> </w:t>
+      </w:r>
+      <w:r>
+        <w:rPr>
+          <w:b/>
+          <w:bCs/>
+        </w:rPr>
+        <w:t>Câu 1 — Ước lượng trung bình và tỷ lệ</w:t>
+      </w:r>
+    </w:p>
+    <w:p>
+      <w:pPr>
+        <w:pStyle w:val="FirstParagraph"/>
+      </w:pPr>
+      <w:r>
+        <w:t>Chúng ta có 3 nhóm dữ liệu về mức tiêu hao nhiên liệu (mpg):</w:t>
+      </w:r>
+    </w:p>
+    <w:p>
+      <w:pPr>
+        <w:pStyle w:val="Compact"/>
+        <w:numPr>
+          <w:ilvl w:val="0"/>
+          <w:numId w:val="18"/>
+        </w:numPr>
+      </w:pPr>
+      <w:r>
+        <w:t>Thành phố</w:t>
+      </w:r>
+    </w:p>
+    <w:p>
+      <w:pPr>
+        <w:pStyle w:val="Compact"/>
+        <w:numPr>
+          <w:ilvl w:val="0"/>
+          <w:numId w:val="18"/>
+        </w:numPr>
+      </w:pPr>
+      <w:r>
+        <w:t>Cao tốc</w:t>
+      </w:r>
+    </w:p>
+    <w:p>
+      <w:pPr>
+        <w:pStyle w:val="Compact"/>
+        <w:numPr>
+          <w:ilvl w:val="0"/>
+          <w:numId w:val="18"/>
+        </w:numPr>
+      </w:pPr>
+      <w:r>
+        <w:t>Hỗn hợp</w:t>
+      </w:r>
+    </w:p>
+    <w:p>
+      <w:pPr>
+        <w:pStyle w:val="FirstParagraph"/>
+      </w:pPr>
+      <w:r>
+        <w:t xml:space="preserve">Nhưng đề yêu cầu làm với </w:t>
+      </w:r>
+      <w:r>
+        <w:rPr>
+          <w:b/>
+          <w:bCs/>
+        </w:rPr>
+        <w:t>Cao tốc</w:t>
+      </w:r>
+      <w:r>
+        <w:t xml:space="preserve"> và </w:t>
+      </w:r>
+      <w:r>
+        <w:rPr>
+          <w:b/>
+          <w:bCs/>
+        </w:rPr>
+        <w:t>Hỗn hợp</w:t>
+      </w:r>
+      <w:r>
+        <w:t xml:space="preserve"> thôi.</w:t>
+      </w:r>
+    </w:p>
+    <w:p>
+      <w:r>
+        <w:pict w14:anchorId="7DBA58CD">
+          <v:rect id="_x0000_i1025" style="width:0;height:1.5pt" o:hralign="center" o:hrstd="t" o:hr="t"/>
+        </w:pict>
+      </w:r>
+    </w:p>
+    <w:p>
+      <w:pPr>
+        <w:pStyle w:val="Heading2"/>
+      </w:pPr>
+      <w:bookmarkStart w:id="2" w:name="dữ-liệu-cao-tốc"/>
+      <w:r>
+        <w:rPr>
+          <w:b/>
+          <w:bCs/>
+        </w:rPr>
+        <w:t>1.1. Dữ liệu Cao tốc</w:t>
+      </w:r>
+    </w:p>
+    <w:p>
+      <w:pPr>
+        <w:pStyle w:val="SourceCode"/>
+      </w:pPr>
+      <w:r>
+        <w:rPr>
+          <w:rStyle w:val="VerbatimChar"/>
+        </w:rPr>
+        <w:t>50.5, 52.1, 48.9, 49.3, 47.5, 51.0, 48.7, 50.2, 49.1, 50.0</w:t>
+      </w:r>
+    </w:p>
+    <w:p>
+      <w:pPr>
+        <w:pStyle w:val="Heading3"/>
+      </w:pPr>
+      <w:bookmarkStart w:id="3" w:name="bước-1-trung-bình-mẫu-mean"/>
+      <w:r>
+        <w:t>Bước 1: Trung bình mẫu (Mean)</w:t>
+      </w:r>
+    </w:p>
+    <w:p>
+      <w:pPr>
+        <w:pStyle w:val="BodyText"/>
+      </w:pPr>
+      <w:r>
+        <w:drawing>
+          <wp:inline distT="0" distB="0" distL="0" distR="0" wp14:anchorId="3F340B2B" wp14:editId="476702C3">
+            <wp:extent cx="5943600" cy="1529715"/>
+            <wp:effectExtent l="0" t="0" r="0" b="0"/>
+            <wp:docPr id="1" name="Picture 1"/>
+            <wp:cNvGraphicFramePr>
+              <a:graphicFrameLocks xmlns:a="http://schemas.openxmlformats.org/drawingml/2006/main" noChangeAspect="1"/>
+            </wp:cNvGraphicFramePr>
+            <a:graphic xmlns:a="http://schemas.openxmlformats.org/drawingml/2006/main">
+              <a:graphicData uri="http://schemas.openxmlformats.org/drawingml/2006/picture">
+                <pic:pic xmlns:pic="http://schemas.openxmlformats.org/drawingml/2006/picture">
+                  <pic:nvPicPr>
+                    <pic:cNvPr id="1" name=""/>
+                    <pic:cNvPicPr/>
+                  </pic:nvPicPr>
+                  <pic:blipFill>
+                    <a:blip r:embed="rId9"/>
+                    <a:stretch>
+                      <a:fillRect/>
+                    </a:stretch>
+                  </pic:blipFill>
+                  <pic:spPr>
+                    <a:xfrm>
+                      <a:off x="0" y="0"/>
+                      <a:ext cx="5943600" cy="1529715"/>
+                    </a:xfrm>
+                    <a:prstGeom prst="rect">
+                      <a:avLst/>
+                    </a:prstGeom>
+                  </pic:spPr>
+                </pic:pic>
+              </a:graphicData>
+            </a:graphic>
+          </wp:inline>
+        </w:drawing>
+      </w:r>
+      <w:r>
+        <w:rPr>
+          <w:rFonts w:ascii="Segoe UI Symbol" w:hAnsi="Segoe UI Symbol" w:cs="Segoe UI Symbol"/>
+        </w:rPr>
+        <w:t>👉</w:t>
+      </w:r>
+      <w:r>
+        <w:t xml:space="preserve"> </w:t>
+      </w:r>
+      <w:r>
+        <w:rPr>
+          <w:b/>
+          <w:bCs/>
+        </w:rPr>
+        <w:t>Trung bình mẫu = 49.73 mpg</w:t>
+      </w:r>
+    </w:p>
+    <w:p>
+      <w:r>
+        <w:lastRenderedPageBreak/>
+        <w:pict w14:anchorId="70EDB2B2">
+          <v:rect id="_x0000_i1026" style="width:0;height:1.5pt" o:hralign="center" o:hrstd="t" o:hr="t"/>
+        </w:pict>
+      </w:r>
+    </w:p>
+    <w:p>
+      <w:pPr>
+        <w:pStyle w:val="Heading3"/>
+      </w:pPr>
+      <w:bookmarkStart w:id="4" w:name="X40f4be8ac932fba21a3e164655d4883a16d829f"/>
+      <w:bookmarkEnd w:id="3"/>
+      <w:r>
+        <w:t>Bước 2: Độ lệch chuẩn mẫu (Sample Standard Deviation)</w:t>
+      </w:r>
+    </w:p>
+    <w:p>
+      <w:pPr>
+        <w:pStyle w:val="FirstParagraph"/>
+      </w:pPr>
+      <w:r>
+        <w:t xml:space="preserve">Độ lệch chuẩn cho biết </w:t>
+      </w:r>
+      <w:r>
+        <w:rPr>
+          <w:b/>
+          <w:bCs/>
+        </w:rPr>
+        <w:t>các giá trị nằm cách trung bình bao xa</w:t>
+      </w:r>
+      <w:r>
+        <w:t>.</w:t>
+      </w:r>
+    </w:p>
+    <w:p>
+      <w:pPr>
+        <w:pStyle w:val="BodyText"/>
+      </w:pPr>
+      <w:r>
+        <w:drawing>
+          <wp:inline distT="0" distB="0" distL="0" distR="0" wp14:anchorId="426F5CC7" wp14:editId="631CC778">
+            <wp:extent cx="5943600" cy="1844675"/>
+            <wp:effectExtent l="0" t="0" r="0" b="3175"/>
+            <wp:docPr id="2" name="Picture 2"/>
+            <wp:cNvGraphicFramePr>
+              <a:graphicFrameLocks xmlns:a="http://schemas.openxmlformats.org/drawingml/2006/main" noChangeAspect="1"/>
+            </wp:cNvGraphicFramePr>
+            <a:graphic xmlns:a="http://schemas.openxmlformats.org/drawingml/2006/main">
+              <a:graphicData uri="http://schemas.openxmlformats.org/drawingml/2006/picture">
+                <pic:pic xmlns:pic="http://schemas.openxmlformats.org/drawingml/2006/picture">
+                  <pic:nvPicPr>
+                    <pic:cNvPr id="1" name=""/>
+                    <pic:cNvPicPr/>
+                  </pic:nvPicPr>
+                  <pic:blipFill>
+                    <a:blip r:embed="rId10"/>
+                    <a:stretch>
+                      <a:fillRect/>
+                    </a:stretch>
+                  </pic:blipFill>
+                  <pic:spPr>
+                    <a:xfrm>
+                      <a:off x="0" y="0"/>
+                      <a:ext cx="5943600" cy="1844675"/>
+                    </a:xfrm>
+                    <a:prstGeom prst="rect">
+                      <a:avLst/>
+                    </a:prstGeom>
+                  </pic:spPr>
+                </pic:pic>
+              </a:graphicData>
+            </a:graphic>
+          </wp:inline>
+        </w:drawing>
+      </w:r>
+      <w:r>
+        <w:rPr>
+          <w:rFonts w:ascii="Segoe UI Symbol" w:hAnsi="Segoe UI Symbol" w:cs="Segoe UI Symbol"/>
+        </w:rPr>
+        <w:t>👉</w:t>
+      </w:r>
+      <w:r>
+        <w:t xml:space="preserve"> </w:t>
+      </w:r>
+      <w:r>
+        <w:rPr>
+          <w:b/>
+          <w:bCs/>
+        </w:rPr>
+        <w:t>Độ lệch chuẩn mẫu = 1.48 mpg</w:t>
+      </w:r>
+    </w:p>
+    <w:p>
+      <w:r>
+        <w:pict w14:anchorId="69ED4B2D">
+          <v:rect id="_x0000_i1027" style="width:0;height:1.5pt" o:hralign="center" o:hrstd="t" o:hr="t"/>
+        </w:pict>
+      </w:r>
+    </w:p>
+    <w:p>
+      <w:pPr>
+        <w:pStyle w:val="Heading3"/>
+      </w:pPr>
+      <w:bookmarkStart w:id="5" w:name="X931ddd469675b130d0684dfc980c10d5580b9c3"/>
+      <w:bookmarkEnd w:id="4"/>
+      <w:r>
+        <w:t>Bước 3: Độ lệch chuẩn của trung bình mẫu (Standard Error)</w:t>
+      </w:r>
+    </w:p>
+    <w:p>
+      <w:pPr>
+        <w:pStyle w:val="BodyText"/>
+      </w:pPr>
+      <w:r>
+        <w:drawing>
+          <wp:inline distT="0" distB="0" distL="0" distR="0" wp14:anchorId="5082F4EC" wp14:editId="0B246C09">
+            <wp:extent cx="5943600" cy="972820"/>
+            <wp:effectExtent l="0" t="0" r="0" b="0"/>
+            <wp:docPr id="3" name="Picture 3"/>
+            <wp:cNvGraphicFramePr>
+              <a:graphicFrameLocks xmlns:a="http://schemas.openxmlformats.org/drawingml/2006/main" noChangeAspect="1"/>
+            </wp:cNvGraphicFramePr>
+            <a:graphic xmlns:a="http://schemas.openxmlformats.org/drawingml/2006/main">
+              <a:graphicData uri="http://schemas.openxmlformats.org/drawingml/2006/picture">
+                <pic:pic xmlns:pic="http://schemas.openxmlformats.org/drawingml/2006/picture">
+                  <pic:nvPicPr>
+                    <pic:cNvPr id="1" name=""/>
+                    <pic:cNvPicPr/>
+                  </pic:nvPicPr>
+                  <pic:blipFill>
+                    <a:blip r:embed="rId11"/>
+                    <a:stretch>
+                      <a:fillRect/>
+                    </a:stretch>
+                  </pic:blipFill>
+                  <pic:spPr>
+                    <a:xfrm>
+                      <a:off x="0" y="0"/>
+                      <a:ext cx="5943600" cy="972820"/>
+                    </a:xfrm>
+                    <a:prstGeom prst="rect">
+                      <a:avLst/>
+                    </a:prstGeom>
+                  </pic:spPr>
+                </pic:pic>
+              </a:graphicData>
+            </a:graphic>
+          </wp:inline>
+        </w:drawing>
+      </w:r>
+      <w:r>
+        <w:rPr>
+          <w:rFonts w:ascii="Segoe UI Symbol" w:hAnsi="Segoe UI Symbol" w:cs="Segoe UI Symbol"/>
+        </w:rPr>
+        <w:t>👉</w:t>
+      </w:r>
+      <w:r>
+        <w:t xml:space="preserve"> </w:t>
+      </w:r>
+      <w:r>
+        <w:rPr>
+          <w:b/>
+          <w:bCs/>
+        </w:rPr>
+        <w:t>Độ lệch chuẩn của trung bình mẫu = 0.47 mpg</w:t>
+      </w:r>
+    </w:p>
+    <w:p>
+      <w:r>
+        <w:pict w14:anchorId="4F69E892">
+          <v:rect id="_x0000_i1028" style="width:0;height:1.5pt" o:hralign="center" o:hrstd="t" o:hr="t"/>
+        </w:pict>
+      </w:r>
+    </w:p>
+    <w:p>
+      <w:pPr>
+        <w:pStyle w:val="Heading2"/>
+      </w:pPr>
+      <w:bookmarkStart w:id="6" w:name="Xec69aeb548532ced89e494167f8203506ce67f0"/>
+      <w:bookmarkEnd w:id="2"/>
+      <w:bookmarkEnd w:id="5"/>
+      <w:r>
+        <w:rPr>
+          <w:b/>
+          <w:bCs/>
+        </w:rPr>
+        <w:t>1.2. Khoảng ước lượng 99% cho trung bình “Hỗn hợp”</w:t>
+      </w:r>
+    </w:p>
+    <w:p>
+      <w:pPr>
+        <w:pStyle w:val="FirstParagraph"/>
+      </w:pPr>
+      <w:r>
+        <w:t>Dữ liệu hỗn hợp:</w:t>
+      </w:r>
+    </w:p>
+    <w:p>
+      <w:pPr>
+        <w:pStyle w:val="SourceCode"/>
+      </w:pPr>
+      <w:r>
+        <w:rPr>
+          <w:rStyle w:val="VerbatimChar"/>
+        </w:rPr>
+        <w:t>44.3, 43.9, 45.6, 46.0, 44.8, 45.2, 46.1, 45.0, 44.6, 45.4</w:t>
+      </w:r>
+    </w:p>
+    <w:p>
+      <w:pPr>
+        <w:pStyle w:val="BodyText"/>
+      </w:pPr>
+      <w:bookmarkStart w:id="7" w:name="độ-lệch-chuẩn-của-trung-bình"/>
+      <w:r>
+        <w:rPr>
+          <w:rFonts w:ascii="Times New Roman" w:eastAsia="Times New Roman" w:hAnsi="Times New Roman" w:cs="Times New Roman"/>
+          <w:b/>
+          <w:bCs/>
+          <w:sz w:val="27"/>
+          <w:szCs w:val="27"/>
+        </w:rPr>
+        <w:lastRenderedPageBreak/>
+        <w:drawing>
+          <wp:inline distT="0" distB="0" distL="0" distR="0" wp14:anchorId="42EC09F6" wp14:editId="580C900B">
+            <wp:extent cx="5943600" cy="3240405"/>
+            <wp:effectExtent l="0" t="0" r="0" b="0"/>
+            <wp:docPr id="4" name="Picture 4"/>
+            <wp:cNvGraphicFramePr>
+              <a:graphicFrameLocks xmlns:a="http://schemas.openxmlformats.org/drawingml/2006/main" noChangeAspect="1"/>
+            </wp:cNvGraphicFramePr>
+            <a:graphic xmlns:a="http://schemas.openxmlformats.org/drawingml/2006/main">
+              <a:graphicData uri="http://schemas.openxmlformats.org/drawingml/2006/picture">
+                <pic:pic xmlns:pic="http://schemas.openxmlformats.org/drawingml/2006/picture">
+                  <pic:nvPicPr>
+                    <pic:cNvPr id="1" name=""/>
+                    <pic:cNvPicPr/>
+                  </pic:nvPicPr>
+                  <pic:blipFill>
+                    <a:blip r:embed="rId12"/>
+                    <a:stretch>
+                      <a:fillRect/>
+                    </a:stretch>
+                  </pic:blipFill>
+                  <pic:spPr>
+                    <a:xfrm>
+                      <a:off x="0" y="0"/>
+                      <a:ext cx="5943600" cy="3240405"/>
+                    </a:xfrm>
+                    <a:prstGeom prst="rect">
+                      <a:avLst/>
+                    </a:prstGeom>
+                  </pic:spPr>
+                </pic:pic>
+              </a:graphicData>
+            </a:graphic>
+          </wp:inline>
+        </w:drawing>
+      </w:r>
+      <w:r>
+        <w:rPr>
+          <w:rFonts w:ascii="Segoe UI Symbol" w:hAnsi="Segoe UI Symbol" w:cs="Segoe UI Symbol"/>
+        </w:rPr>
+        <w:t>👉</w:t>
+      </w:r>
+      <w:r>
+        <w:t xml:space="preserve"> </w:t>
+      </w:r>
+      <w:r>
+        <w:rPr>
+          <w:b/>
+          <w:bCs/>
+        </w:rPr>
+        <w:t>Khoảng ước lượng 99%:</w:t>
+      </w:r>
+      <w:r>
+        <w:t xml:space="preserve"> </w:t>
+      </w:r>
+      <w:r>
+        <w:rPr>
+          <w:b/>
+          <w:bCs/>
+        </w:rPr>
+        <w:t>(44.39 ; 45.79)</w:t>
+      </w:r>
+      <w:r>
+        <w:t xml:space="preserve"> mpg</w:t>
+      </w:r>
+    </w:p>
+    <w:p>
+      <w:pPr>
+        <w:pStyle w:val="BlockText"/>
+      </w:pPr>
+      <w:r>
+        <w:t>Diễn giải: ta tin 99% rằng trung bình thực tế của loại xe này khi chạy hỗn hợp nằm giữa 44.39 và 45.79 mpg.</w:t>
+      </w:r>
+    </w:p>
+    <w:p>
+      <w:r>
+        <w:pict w14:anchorId="2D0C001B">
+          <v:rect id="_x0000_i1029" style="width:0;height:1.5pt" o:hralign="center" o:hrstd="t" o:hr="t"/>
+        </w:pict>
+      </w:r>
+    </w:p>
+    <w:p>
+      <w:pPr>
+        <w:pStyle w:val="Heading2"/>
+      </w:pPr>
+      <w:bookmarkStart w:id="8" w:name="X47d50b1ddccb057576072808a3b105a136cbf46"/>
+      <w:bookmarkEnd w:id="6"/>
+      <w:bookmarkEnd w:id="7"/>
+      <w:r>
+        <w:rPr>
+          <w:b/>
+          <w:bCs/>
+        </w:rPr>
+        <w:t>1.3. Khoảng ước lượng 95% cho tỷ lệ “hiệu suất cao”</w:t>
+      </w:r>
+    </w:p>
+    <w:p>
+      <w:pPr>
+        <w:pStyle w:val="FirstParagraph"/>
+      </w:pPr>
+      <w:r>
+        <w:t>Dữ liệu hỗn hợp có 10 xe, hiệu suất cao nếu mpg ≥ 45.</w:t>
+      </w:r>
+    </w:p>
+    <w:p>
+      <w:pPr>
+        <w:pStyle w:val="BodyText"/>
+      </w:pPr>
+      <w:r>
+        <w:t xml:space="preserve">Giá trị ≥ 45: → 45.6, 46.0, 45.2, 46.1, 45.0, 45.4 → </w:t>
+      </w:r>
+      <w:r>
+        <w:rPr>
+          <w:b/>
+          <w:bCs/>
+        </w:rPr>
+        <w:t>6 xe</w:t>
+      </w:r>
+    </w:p>
+    <w:p>
+      <w:pPr>
+        <w:pStyle w:val="BodyText"/>
+      </w:pPr>
+      <w:r>
+        <w:lastRenderedPageBreak/>
+        <w:drawing>
+          <wp:inline distT="0" distB="0" distL="0" distR="0" wp14:anchorId="600FB978" wp14:editId="483CDC78">
+            <wp:extent cx="5943600" cy="3196590"/>
+            <wp:effectExtent l="0" t="0" r="0" b="3810"/>
+            <wp:docPr id="5" name="Picture 5"/>
+            <wp:cNvGraphicFramePr>
+              <a:graphicFrameLocks xmlns:a="http://schemas.openxmlformats.org/drawingml/2006/main" noChangeAspect="1"/>
+            </wp:cNvGraphicFramePr>
+            <a:graphic xmlns:a="http://schemas.openxmlformats.org/drawingml/2006/main">
+              <a:graphicData uri="http://schemas.openxmlformats.org/drawingml/2006/picture">
+                <pic:pic xmlns:pic="http://schemas.openxmlformats.org/drawingml/2006/picture">
+                  <pic:nvPicPr>
+                    <pic:cNvPr id="1" name=""/>
+                    <pic:cNvPicPr/>
+                  </pic:nvPicPr>
+                  <pic:blipFill>
+                    <a:blip r:embed="rId13"/>
+                    <a:stretch>
+                      <a:fillRect/>
+                    </a:stretch>
+                  </pic:blipFill>
+                  <pic:spPr>
+                    <a:xfrm>
+                      <a:off x="0" y="0"/>
+                      <a:ext cx="5943600" cy="3196590"/>
+                    </a:xfrm>
+                    <a:prstGeom prst="rect">
+                      <a:avLst/>
+                    </a:prstGeom>
+                  </pic:spPr>
+                </pic:pic>
+              </a:graphicData>
+            </a:graphic>
+          </wp:inline>
+        </w:drawing>
+      </w:r>
+      <w:r>
+        <w:rPr>
+          <w:rFonts w:ascii="Segoe UI Symbol" w:hAnsi="Segoe UI Symbol" w:cs="Segoe UI Symbol"/>
+        </w:rPr>
+        <w:t>👉</w:t>
+      </w:r>
+      <w:r>
+        <w:t xml:space="preserve"> </w:t>
+      </w:r>
+      <w:r>
+        <w:rPr>
+          <w:b/>
+          <w:bCs/>
+        </w:rPr>
+        <w:t>Khoảng ước lượng 95%:</w:t>
+      </w:r>
+      <w:r>
+        <w:t xml:space="preserve"> </w:t>
+      </w:r>
+      <w:r>
+        <w:rPr>
+          <w:b/>
+          <w:bCs/>
+        </w:rPr>
+        <w:t>(0.30 ; 0.90)</w:t>
+      </w:r>
+    </w:p>
+    <w:p>
+      <w:pPr>
+        <w:pStyle w:val="BlockText"/>
+      </w:pPr>
+      <w:r>
+        <w:t>Nghĩa là ta tin 95% rằng tỷ lệ xe “hiệu suất cao” thực sự nằm từ 30% đến 90%.</w:t>
+      </w:r>
+    </w:p>
+    <w:p>
+      <w:r>
+        <w:pict w14:anchorId="406CE832">
+          <v:rect id="_x0000_i1030" style="width:0;height:1.5pt" o:hralign="center" o:hrstd="t" o:hr="t"/>
+        </w:pict>
+      </w:r>
+    </w:p>
+    <w:p>
+      <w:pPr>
+        <w:pStyle w:val="Heading1"/>
+      </w:pPr>
+      <w:bookmarkStart w:id="9" w:name="câu-2-kiểm-định-giả-thuyết"/>
+      <w:bookmarkEnd w:id="1"/>
+      <w:bookmarkEnd w:id="8"/>
+      <w:r>
+        <w:rPr>
+          <w:rFonts w:ascii="Calibri Light" w:hAnsi="Calibri Light" w:cs="Calibri Light"/>
+        </w:rPr>
+        <w:t>🧩</w:t>
+      </w:r>
+      <w:r>
+        <w:t xml:space="preserve"> </w:t>
+      </w:r>
+      <w:r>
+        <w:rPr>
+          <w:b/>
+          <w:bCs/>
+        </w:rPr>
+        <w:t>Câu 2 — Kiểm định giả thuyết</w:t>
+      </w:r>
+    </w:p>
+    <w:p>
+      <w:pPr>
+        <w:pStyle w:val="FirstParagraph"/>
+      </w:pPr>
+      <w:r>
+        <w:t xml:space="preserve">Phần này ta sẽ học </w:t>
+      </w:r>
+      <w:r>
+        <w:rPr>
+          <w:b/>
+          <w:bCs/>
+        </w:rPr>
+        <w:t>kiểm định</w:t>
+      </w:r>
+      <w:r>
+        <w:t xml:space="preserve"> một cách dễ hiểu nhất.</w:t>
+      </w:r>
+    </w:p>
+    <w:p>
+      <w:r>
+        <w:pict w14:anchorId="2D149E95">
+          <v:rect id="_x0000_i1031" style="width:0;height:1.5pt" o:hralign="center" o:hrstd="t" o:hr="t"/>
+        </w:pict>
+      </w:r>
+    </w:p>
+    <w:p>
+      <w:pPr>
+        <w:pStyle w:val="Heading2"/>
+      </w:pPr>
+      <w:bookmarkStart w:id="10" w:name="thời-gian-sử-dụng-ứng-dụng"/>
+      <w:r>
+        <w:rPr>
+          <w:b/>
+          <w:bCs/>
+        </w:rPr>
+        <w:t>2.1. Thời gian sử dụng ứng dụng</w:t>
+      </w:r>
+    </w:p>
+    <w:p>
+      <w:pPr>
+        <w:pStyle w:val="FirstParagraph"/>
+      </w:pPr>
+      <w:r>
+        <w:t xml:space="preserve">Dữ liệu (phút): </w:t>
+      </w:r>
+      <w:r>
+        <w:rPr>
+          <w:rStyle w:val="VerbatimChar"/>
+        </w:rPr>
+        <w:t>110, 125, 118, 130, 122, 115, 128, 117, 120, 123, 127, 124, 129, 119, 121</w:t>
+      </w:r>
+    </w:p>
+    <w:p>
+      <w:pPr>
+        <w:pStyle w:val="Heading3"/>
+      </w:pPr>
+      <w:bookmarkStart w:id="11" w:name="mục-tiêu"/>
+      <w:r>
+        <w:t>Mục tiêu:</w:t>
+      </w:r>
+    </w:p>
+    <w:p>
+      <w:pPr>
+        <w:pStyle w:val="FirstParagraph"/>
+      </w:pPr>
+      <w:r>
+        <w:t xml:space="preserve">Xem </w:t>
+      </w:r>
+      <w:r>
+        <w:rPr>
+          <w:b/>
+          <w:bCs/>
+        </w:rPr>
+        <w:t>trung bình có khác 120 không</w:t>
+      </w:r>
+      <w:r>
+        <w:t xml:space="preserve">, khi biết </w:t>
+      </w:r>
+      <w:r>
+        <w:rPr>
+          <w:b/>
+          <w:bCs/>
+        </w:rPr>
+        <w:t>phương sai tổng thể = 36</w:t>
+      </w:r>
+      <w:r>
+        <w:t xml:space="preserve"> (tức độ lệch chuẩn = 6).</w:t>
+      </w:r>
+    </w:p>
+    <w:p>
+      <w:r>
+        <w:pict w14:anchorId="0B147A7F">
+          <v:rect id="_x0000_i1032" style="width:0;height:1.5pt" o:hralign="center" o:hrstd="t" o:hr="t"/>
+        </w:pict>
+      </w:r>
+    </w:p>
+    <w:p>
+      <w:pPr>
+        <w:pStyle w:val="BodyText"/>
+      </w:pPr>
+      <w:bookmarkStart w:id="12" w:name="công-thức-kiểm-định-z"/>
+      <w:bookmarkEnd w:id="11"/>
+      <w:r>
+        <w:rPr>
+          <w:rFonts w:ascii="Times New Roman" w:eastAsia="Times New Roman" w:hAnsi="Times New Roman" w:cs="Times New Roman"/>
+          <w:b/>
+          <w:bCs/>
+          <w:sz w:val="27"/>
+          <w:szCs w:val="27"/>
+        </w:rPr>
+        <w:lastRenderedPageBreak/>
+        <w:drawing>
+          <wp:inline distT="0" distB="0" distL="0" distR="0" wp14:anchorId="311E6686" wp14:editId="167CB3C0">
+            <wp:extent cx="5943600" cy="2675890"/>
+            <wp:effectExtent l="0" t="0" r="0" b="0"/>
+            <wp:docPr id="6" name="Picture 6"/>
+            <wp:cNvGraphicFramePr>
+              <a:graphicFrameLocks xmlns:a="http://schemas.openxmlformats.org/drawingml/2006/main" noChangeAspect="1"/>
+            </wp:cNvGraphicFramePr>
+            <a:graphic xmlns:a="http://schemas.openxmlformats.org/drawingml/2006/main">
+              <a:graphicData uri="http://schemas.openxmlformats.org/drawingml/2006/picture">
+                <pic:pic xmlns:pic="http://schemas.openxmlformats.org/drawingml/2006/picture">
+                  <pic:nvPicPr>
+                    <pic:cNvPr id="1" name=""/>
+                    <pic:cNvPicPr/>
+                  </pic:nvPicPr>
+                  <pic:blipFill>
+                    <a:blip r:embed="rId14"/>
+                    <a:stretch>
+                      <a:fillRect/>
+                    </a:stretch>
+                  </pic:blipFill>
+                  <pic:spPr>
+                    <a:xfrm>
+                      <a:off x="0" y="0"/>
+                      <a:ext cx="5943600" cy="2675890"/>
+                    </a:xfrm>
+                    <a:prstGeom prst="rect">
+                      <a:avLst/>
+                    </a:prstGeom>
+                  </pic:spPr>
+                </pic:pic>
+              </a:graphicData>
+            </a:graphic>
+          </wp:inline>
+        </w:drawing>
+      </w:r>
+      <w:r>
+        <w:t xml:space="preserve">→ </w:t>
+      </w:r>
+      <w:r>
+        <w:rPr>
+          <w:b/>
+          <w:bCs/>
+        </w:rPr>
+        <w:t xml:space="preserve">1.63 &lt; 1.96 </w:t>
+      </w:r>
+      <w:r>
+        <w:rPr>
+          <w:rFonts w:ascii="Cambria Math" w:hAnsi="Cambria Math" w:cs="Cambria Math"/>
+          <w:b/>
+          <w:bCs/>
+        </w:rPr>
+        <w:t>⇒</w:t>
+      </w:r>
+      <w:r>
+        <w:rPr>
+          <w:b/>
+          <w:bCs/>
+        </w:rPr>
+        <w:t xml:space="preserve"> kh</w:t>
+      </w:r>
+      <w:r>
+        <w:rPr>
+          <w:rFonts w:ascii="Calibri" w:hAnsi="Calibri" w:cs="Calibri"/>
+          <w:b/>
+          <w:bCs/>
+        </w:rPr>
+        <w:t>ô</w:t>
+      </w:r>
+      <w:r>
+        <w:rPr>
+          <w:b/>
+          <w:bCs/>
+        </w:rPr>
+        <w:t xml:space="preserve">ng </w:t>
+      </w:r>
+      <w:r>
+        <w:rPr>
+          <w:rFonts w:ascii="Calibri" w:hAnsi="Calibri" w:cs="Calibri"/>
+          <w:b/>
+          <w:bCs/>
+        </w:rPr>
+        <w:t>đ</w:t>
+      </w:r>
+      <w:r>
+        <w:rPr>
+          <w:b/>
+          <w:bCs/>
+        </w:rPr>
+        <w:t>ủ bằng chứng bác bỏ giả thuyết.</w:t>
+      </w:r>
+    </w:p>
+    <w:p>
+      <w:pPr>
+        <w:pStyle w:val="BodyText"/>
+      </w:pPr>
+      <w:r>
+        <w:rPr>
+          <w:rFonts w:ascii="Segoe UI Symbol" w:hAnsi="Segoe UI Symbol" w:cs="Segoe UI Symbol"/>
+        </w:rPr>
+        <w:t>👉</w:t>
+      </w:r>
+      <w:r>
+        <w:t xml:space="preserve"> </w:t>
+      </w:r>
+      <w:r>
+        <w:rPr>
+          <w:b/>
+          <w:bCs/>
+        </w:rPr>
+        <w:t>Kết luận:</w:t>
+      </w:r>
+      <w:r>
+        <w:t xml:space="preserve"> Thời gian sử dụng trung bình </w:t>
+      </w:r>
+      <w:r>
+        <w:rPr>
+          <w:b/>
+          <w:bCs/>
+        </w:rPr>
+        <w:t>không khác 120 phút đáng kể.</w:t>
+      </w:r>
+    </w:p>
+    <w:p>
+      <w:r>
+        <w:pict w14:anchorId="2BAC0EBD">
+          <v:rect id="_x0000_i1033" style="width:0;height:1.5pt" o:hralign="center" o:hrstd="t" o:hr="t"/>
+        </w:pict>
+      </w:r>
+    </w:p>
+    <w:p>
+      <w:pPr>
+        <w:pStyle w:val="Heading2"/>
+      </w:pPr>
+      <w:bookmarkStart w:id="13" w:name="chi-tiêu-trung-bình"/>
+      <w:bookmarkEnd w:id="10"/>
+      <w:bookmarkEnd w:id="12"/>
+      <w:r>
+        <w:rPr>
+          <w:b/>
+          <w:bCs/>
+        </w:rPr>
+        <w:t>2.2. Chi tiêu trung bình</w:t>
+      </w:r>
+    </w:p>
+    <w:p>
+      <w:pPr>
+        <w:pStyle w:val="FirstParagraph"/>
+      </w:pPr>
+      <w:r>
+        <w:t xml:space="preserve">Dữ liệu (nghìn): </w:t>
+      </w:r>
+      <w:r>
+        <w:rPr>
+          <w:rStyle w:val="VerbatimChar"/>
+        </w:rPr>
+        <w:t>520, 480, 495, 510, 470, 530, 490, 485, 505, 515</w:t>
+      </w:r>
+    </w:p>
+    <w:p>
+      <w:pPr>
+        <w:pStyle w:val="BodyText"/>
+      </w:pPr>
+      <w:bookmarkStart w:id="14" w:name="Xa7b3e5239b3f3e37cce7fc2464771ad04e67da7"/>
+      <w:r>
+        <w:rPr>
+          <w:rFonts w:ascii="Segoe UI Symbol" w:hAnsi="Segoe UI Symbol" w:cs="Segoe UI Symbol"/>
+        </w:rPr>
+        <w:drawing>
+          <wp:inline distT="0" distB="0" distL="0" distR="0" wp14:anchorId="147993A7" wp14:editId="10C2B11B">
+            <wp:extent cx="5943600" cy="2865120"/>
+            <wp:effectExtent l="0" t="0" r="0" b="0"/>
+            <wp:docPr id="7" name="Picture 7"/>
+            <wp:cNvGraphicFramePr>
+              <a:graphicFrameLocks xmlns:a="http://schemas.openxmlformats.org/drawingml/2006/main" noChangeAspect="1"/>
+            </wp:cNvGraphicFramePr>
+            <a:graphic xmlns:a="http://schemas.openxmlformats.org/drawingml/2006/main">
+              <a:graphicData uri="http://schemas.openxmlformats.org/drawingml/2006/picture">
+                <pic:pic xmlns:pic="http://schemas.openxmlformats.org/drawingml/2006/picture">
+                  <pic:nvPicPr>
+                    <pic:cNvPr id="1" name=""/>
+                    <pic:cNvPicPr/>
+                  </pic:nvPicPr>
+                  <pic:blipFill>
+                    <a:blip r:embed="rId15"/>
+                    <a:stretch>
+                      <a:fillRect/>
+                    </a:stretch>
+                  </pic:blipFill>
+                  <pic:spPr>
+                    <a:xfrm>
+                      <a:off x="0" y="0"/>
+                      <a:ext cx="5943600" cy="2865120"/>
+                    </a:xfrm>
+                    <a:prstGeom prst="rect">
+                      <a:avLst/>
+                    </a:prstGeom>
+                  </pic:spPr>
+                </pic:pic>
+              </a:graphicData>
+            </a:graphic>
+          </wp:inline>
+        </w:drawing>
+      </w:r>
+      <w:r>
+        <w:rPr>
+          <w:rFonts w:ascii="Segoe UI Symbol" w:hAnsi="Segoe UI Symbol" w:cs="Segoe UI Symbol"/>
+        </w:rPr>
+        <w:t>👉</w:t>
+      </w:r>
+      <w:r>
+        <w:t xml:space="preserve"> </w:t>
+      </w:r>
+      <w:r>
+        <w:rPr>
+          <w:b/>
+          <w:bCs/>
+        </w:rPr>
+        <w:t>Không bác bỏ giả thuyết.</w:t>
+      </w:r>
+    </w:p>
+    <w:p>
+      <w:pPr>
+        <w:pStyle w:val="BlockText"/>
+      </w:pPr>
+      <w:r>
+        <w:t xml:space="preserve">Tức là chi tiêu trung bình </w:t>
+      </w:r>
+      <w:r>
+        <w:rPr>
+          <w:b/>
+          <w:bCs/>
+        </w:rPr>
+        <w:t>đúng khoảng 500 nghìn</w:t>
+      </w:r>
+      <w:r>
+        <w:t>.</w:t>
+      </w:r>
+    </w:p>
+    <w:p>
+      <w:r>
+        <w:pict w14:anchorId="02BE2FC5">
+          <v:rect id="_x0000_i1034" style="width:0;height:1.5pt" o:hralign="center" o:hrstd="t" o:hr="t"/>
+        </w:pict>
+      </w:r>
+    </w:p>
+    <w:p>
+      <w:pPr>
+        <w:pStyle w:val="Heading2"/>
+      </w:pPr>
+      <w:bookmarkStart w:id="15" w:name="tỷ-lệ-mua-hàng-online-qua-điện-thoại"/>
+      <w:bookmarkEnd w:id="13"/>
+      <w:bookmarkEnd w:id="14"/>
+      <w:r>
+        <w:rPr>
+          <w:b/>
+          <w:bCs/>
+        </w:rPr>
+        <w:t>2.3. Tỷ lệ mua hàng online qua điện thoại</w:t>
+      </w:r>
+    </w:p>
+    <w:p>
+      <w:pPr>
+        <w:pStyle w:val="FirstParagraph"/>
+      </w:pPr>
+      <w:r>
+        <w:t>68/100 người = 0.68</w:t>
+      </w:r>
+    </w:p>
+    <w:p>
+      <w:pPr>
+        <w:pStyle w:val="BodyText"/>
+      </w:pPr>
+      <w:r>
+        <w:lastRenderedPageBreak/>
+        <w:drawing>
+          <wp:inline distT="0" distB="0" distL="0" distR="0" wp14:anchorId="6DFB983B" wp14:editId="680BFDBA">
+            <wp:extent cx="5877745" cy="1819529"/>
+            <wp:effectExtent l="0" t="0" r="0" b="9525"/>
+            <wp:docPr id="8" name="Picture 8"/>
+            <wp:cNvGraphicFramePr>
+              <a:graphicFrameLocks xmlns:a="http://schemas.openxmlformats.org/drawingml/2006/main" noChangeAspect="1"/>
+            </wp:cNvGraphicFramePr>
+            <a:graphic xmlns:a="http://schemas.openxmlformats.org/drawingml/2006/main">
+              <a:graphicData uri="http://schemas.openxmlformats.org/drawingml/2006/picture">
+                <pic:pic xmlns:pic="http://schemas.openxmlformats.org/drawingml/2006/picture">
+                  <pic:nvPicPr>
+                    <pic:cNvPr id="1" name=""/>
+                    <pic:cNvPicPr/>
+                  </pic:nvPicPr>
+                  <pic:blipFill>
+                    <a:blip r:embed="rId16"/>
+                    <a:stretch>
+                      <a:fillRect/>
+                    </a:stretch>
+                  </pic:blipFill>
+                  <pic:spPr>
+                    <a:xfrm>
+                      <a:off x="0" y="0"/>
+                      <a:ext cx="5877745" cy="1819529"/>
+                    </a:xfrm>
+                    <a:prstGeom prst="rect">
+                      <a:avLst/>
+                    </a:prstGeom>
+                  </pic:spPr>
+                </pic:pic>
+              </a:graphicData>
+            </a:graphic>
+          </wp:inline>
+        </w:drawing>
+      </w:r>
+      <w:r>
+        <w:rPr>
+          <w:rFonts w:ascii="Segoe UI Symbol" w:hAnsi="Segoe UI Symbol" w:cs="Segoe UI Symbol"/>
+        </w:rPr>
+        <w:t>👉</w:t>
+      </w:r>
+      <w:r>
+        <w:t xml:space="preserve"> </w:t>
+      </w:r>
+      <w:r>
+        <w:rPr>
+          <w:b/>
+          <w:bCs/>
+        </w:rPr>
+        <w:t>Kết luận:</w:t>
+      </w:r>
+      <w:r>
+        <w:t xml:space="preserve"> Chưa thể khẳng định tỷ lệ &gt; 60%.</w:t>
+      </w:r>
+    </w:p>
+    <w:p>
+      <w:r>
+        <w:pict w14:anchorId="553B5A81">
+          <v:rect id="_x0000_i1035" style="width:0;height:1.5pt" o:hralign="center" o:hrstd="t" o:hr="t"/>
+        </w:pict>
+      </w:r>
+    </w:p>
+    <w:p>
+      <w:pPr>
+        <w:pStyle w:val="Heading1"/>
+      </w:pPr>
+      <w:bookmarkStart w:id="16" w:name="X0048484181729287d01e0e305bd588e407226b0"/>
+      <w:bookmarkEnd w:id="9"/>
+      <w:bookmarkEnd w:id="15"/>
+      <w:r>
+        <w:rPr>
+          <w:rFonts w:ascii="Segoe UI Symbol" w:hAnsi="Segoe UI Symbol" w:cs="Segoe UI Symbol"/>
+        </w:rPr>
+        <w:t>📈</w:t>
+      </w:r>
+      <w:r>
+        <w:t xml:space="preserve"> </w:t>
+      </w:r>
+      <w:r>
+        <w:rPr>
+          <w:b/>
+          <w:bCs/>
+        </w:rPr>
+        <w:t>Câu 3 — Hồi quy tuyến tính (Quan hệ giữa giờ học và điểm)</w:t>
+      </w:r>
+    </w:p>
+    <w:p>
+      <w:pPr>
+        <w:pStyle w:val="FirstParagraph"/>
+      </w:pPr>
+      <w:r>
+        <w:t>Dữ liệu:</w:t>
+      </w:r>
+    </w:p>
+    <w:tbl>
+      <w:tblPr>
+        <w:tblStyle w:val="Table"/>
+        <w:tblW w:w="5000" w:type="pct"/>
+        <w:tblLayout w:type="fixed"/>
+        <w:tblLook w:val="0020" w:firstRow="1" w:lastRow="0" w:firstColumn="0" w:lastColumn="0" w:noHBand="0" w:noVBand="0"/>
+      </w:tblPr>
+      <w:tblGrid>
+        <w:gridCol w:w="2511"/>
+        <w:gridCol w:w="684"/>
+        <w:gridCol w:w="685"/>
+        <w:gridCol w:w="685"/>
+        <w:gridCol w:w="685"/>
+        <w:gridCol w:w="685"/>
+        <w:gridCol w:w="685"/>
+        <w:gridCol w:w="685"/>
+        <w:gridCol w:w="685"/>
+        <w:gridCol w:w="685"/>
+        <w:gridCol w:w="685"/>
+      </w:tblGrid>
+      <w:tr>
+        <w:trPr>
+          <w:cnfStyle w:val="100000000000" w:firstRow="1" w:lastRow="0" w:firstColumn="0" w:lastColumn="0" w:oddVBand="0" w:evenVBand="0" w:oddHBand="0" w:evenHBand="0" w:firstRowFirstColumn="0" w:firstRowLastColumn="0" w:lastRowFirstColumn="0" w:lastRowLastColumn="0"/>
+          <w:tblHeader/>
+        </w:trPr>
+        <w:tc>
+          <w:tcPr>
+            <w:tcW w:w="2124" w:type="dxa"/>
+          </w:tcPr>
+          <w:p>
+            <w:pPr>
+              <w:pStyle w:val="Compact"/>
+              <w:jc w:val="center"/>
+            </w:pPr>
+            <w:r>
+              <w:t>x (giờ học)</w:t>
+            </w:r>
+          </w:p>
+        </w:tc>
+        <w:tc>
+          <w:tcPr>
+            <w:tcW w:w="579" w:type="dxa"/>
+          </w:tcPr>
+          <w:p>
+            <w:pPr>
+              <w:pStyle w:val="Compact"/>
+              <w:jc w:val="center"/>
+            </w:pPr>
+            <w:r>
+              <w:t>1.2</w:t>
+            </w:r>
+          </w:p>
+        </w:tc>
+        <w:tc>
+          <w:tcPr>
+            <w:tcW w:w="579" w:type="dxa"/>
+          </w:tcPr>
+          <w:p>
+            <w:pPr>
+              <w:pStyle w:val="Compact"/>
+              <w:jc w:val="center"/>
+            </w:pPr>
+            <w:r>
+              <w:t>2.8</w:t>
+            </w:r>
+          </w:p>
+        </w:tc>
+        <w:tc>
+          <w:tcPr>
+            <w:tcW w:w="579" w:type="dxa"/>
+          </w:tcPr>
+          <w:p>
+            <w:pPr>
+              <w:pStyle w:val="Compact"/>
+              <w:jc w:val="center"/>
+            </w:pPr>
+            <w:r>
+              <w:t>3.5</w:t>
+            </w:r>
+          </w:p>
+        </w:tc>
+        <w:tc>
+          <w:tcPr>
+            <w:tcW w:w="579" w:type="dxa"/>
+          </w:tcPr>
+          <w:p>
+            <w:pPr>
+              <w:pStyle w:val="Compact"/>
+              <w:jc w:val="center"/>
+            </w:pPr>
+            <w:r>
+              <w:t>1.9</w:t>
+            </w:r>
+          </w:p>
+        </w:tc>
+        <w:tc>
+          <w:tcPr>
+            <w:tcW w:w="579" w:type="dxa"/>
+          </w:tcPr>
+          <w:p>
+            <w:pPr>
+              <w:pStyle w:val="Compact"/>
+              <w:jc w:val="center"/>
+            </w:pPr>
+            <w:r>
+              <w:t>4.0</w:t>
+            </w:r>
+          </w:p>
+        </w:tc>
+        <w:tc>
+          <w:tcPr>
+            <w:tcW w:w="579" w:type="dxa"/>
+          </w:tcPr>
+          <w:p>
+            <w:pPr>
+              <w:pStyle w:val="Compact"/>
+              <w:jc w:val="center"/>
+            </w:pPr>
+            <w:r>
+              <w:t>2.2</w:t>
+            </w:r>
+          </w:p>
+        </w:tc>
+        <w:tc>
+          <w:tcPr>
+            <w:tcW w:w="579" w:type="dxa"/>
+          </w:tcPr>
+          <w:p>
+            <w:pPr>
+              <w:pStyle w:val="Compact"/>
+              <w:jc w:val="center"/>
+            </w:pPr>
+            <w:r>
+              <w:t>5.5</w:t>
+            </w:r>
+          </w:p>
+        </w:tc>
+        <w:tc>
+          <w:tcPr>
+            <w:tcW w:w="579" w:type="dxa"/>
+          </w:tcPr>
+          <w:p>
+            <w:pPr>
+              <w:pStyle w:val="Compact"/>
+              <w:jc w:val="center"/>
+            </w:pPr>
+            <w:r>
+              <w:t>3.0</w:t>
+            </w:r>
+          </w:p>
+        </w:tc>
+        <w:tc>
+          <w:tcPr>
+            <w:tcW w:w="579" w:type="dxa"/>
+          </w:tcPr>
+          <w:p>
+            <w:pPr>
+              <w:pStyle w:val="Compact"/>
+              <w:jc w:val="center"/>
+            </w:pPr>
+            <w:r>
+              <w:t>4.3</w:t>
+            </w:r>
+          </w:p>
+        </w:tc>
+        <w:tc>
+          <w:tcPr>
+            <w:tcW w:w="579" w:type="dxa"/>
+          </w:tcPr>
+          <w:p>
+            <w:pPr>
+              <w:pStyle w:val="Compact"/>
+              <w:jc w:val="center"/>
+            </w:pPr>
+            <w:r>
+              <w:t>1.5</w:t>
+            </w:r>
+          </w:p>
+        </w:tc>
+      </w:tr>
+      <w:tr>
+        <w:tc>
+          <w:tcPr>
+            <w:tcW w:w="2124" w:type="dxa"/>
+          </w:tcPr>
+          <w:p>
+            <w:pPr>
+              <w:pStyle w:val="Compact"/>
+              <w:jc w:val="center"/>
+            </w:pPr>
+            <w:r>
+              <w:t>y (điểm)</w:t>
+            </w:r>
+          </w:p>
+        </w:tc>
+        <w:tc>
+          <w:tcPr>
+            <w:tcW w:w="579" w:type="dxa"/>
+          </w:tcPr>
+          <w:p>
+            <w:pPr>
+              <w:pStyle w:val="Compact"/>
+              <w:jc w:val="center"/>
+            </w:pPr>
+            <w:r>
+              <w:t>38</w:t>
+            </w:r>
+          </w:p>
+        </w:tc>
+        <w:tc>
+          <w:tcPr>
+            <w:tcW w:w="579" w:type="dxa"/>
+          </w:tcPr>
+          <w:p>
+            <w:pPr>
+              <w:pStyle w:val="Compact"/>
+              <w:jc w:val="center"/>
+            </w:pPr>
+            <w:r>
+              <w:t>51</w:t>
+            </w:r>
+          </w:p>
+        </w:tc>
+        <w:tc>
+          <w:tcPr>
+            <w:tcW w:w="579" w:type="dxa"/>
+          </w:tcPr>
+          <w:p>
+            <w:pPr>
+              <w:pStyle w:val="Compact"/>
+              <w:jc w:val="center"/>
+            </w:pPr>
+            <w:r>
+              <w:t>57</w:t>
+            </w:r>
+          </w:p>
+        </w:tc>
+        <w:tc>
+          <w:tcPr>
+            <w:tcW w:w="579" w:type="dxa"/>
+          </w:tcPr>
+          <w:p>
+            <w:pPr>
+              <w:pStyle w:val="Compact"/>
+              <w:jc w:val="center"/>
+            </w:pPr>
+            <w:r>
+              <w:t>45</w:t>
+            </w:r>
+          </w:p>
+        </w:tc>
+        <w:tc>
+          <w:tcPr>
+            <w:tcW w:w="579" w:type="dxa"/>
+          </w:tcPr>
+          <w:p>
+            <w:pPr>
+              <w:pStyle w:val="Compact"/>
+              <w:jc w:val="center"/>
+            </w:pPr>
+            <w:r>
+              <w:t>61</w:t>
+            </w:r>
+          </w:p>
+        </w:tc>
+        <w:tc>
+          <w:tcPr>
+            <w:tcW w:w="579" w:type="dxa"/>
+          </w:tcPr>
+          <w:p>
+            <w:pPr>
+              <w:pStyle w:val="Compact"/>
+              <w:jc w:val="center"/>
+            </w:pPr>
+            <w:r>
+              <w:t>47</w:t>
+            </w:r>
+          </w:p>
+        </w:tc>
+        <w:tc>
+          <w:tcPr>
+            <w:tcW w:w="579" w:type="dxa"/>
+          </w:tcPr>
+          <w:p>
+            <w:pPr>
+              <w:pStyle w:val="Compact"/>
+              <w:jc w:val="center"/>
+            </w:pPr>
+            <w:r>
+              <w:t>73</w:t>
+            </w:r>
+          </w:p>
+        </w:tc>
+        <w:tc>
+          <w:tcPr>
+            <w:tcW w:w="579" w:type="dxa"/>
+          </w:tcPr>
+          <w:p>
+            <w:pPr>
+              <w:pStyle w:val="Compact"/>
+              <w:jc w:val="center"/>
+            </w:pPr>
+            <w:r>
+              <w:t>53</w:t>
+            </w:r>
+          </w:p>
+        </w:tc>
+        <w:tc>
+          <w:tcPr>
+            <w:tcW w:w="579" w:type="dxa"/>
+          </w:tcPr>
+          <w:p>
+            <w:pPr>
+              <w:pStyle w:val="Compact"/>
+              <w:jc w:val="center"/>
+            </w:pPr>
+            <w:r>
+              <w:t>66</w:t>
+            </w:r>
+          </w:p>
+        </w:tc>
+        <w:tc>
+          <w:tcPr>
+            <w:tcW w:w="579" w:type="dxa"/>
+          </w:tcPr>
+          <w:p>
+            <w:pPr>
+              <w:pStyle w:val="Compact"/>
+              <w:jc w:val="center"/>
+            </w:pPr>
+            <w:r>
+              <w:t>41</w:t>
+            </w:r>
+          </w:p>
+        </w:tc>
+      </w:tr>
+    </w:tbl>
+    <w:p>
+      <w:r>
+        <w:pict w14:anchorId="610BDAB5">
+          <v:rect id="_x0000_i1036" style="width:0;height:1.5pt" o:hralign="center" o:hrstd="t" o:hr="t"/>
+        </w:pict>
+      </w:r>
+    </w:p>
+    <w:p>
+      <w:pPr>
+        <w:pStyle w:val="Heading3"/>
+      </w:pPr>
+      <w:bookmarkStart w:id="17" w:name="bước-1-ý-tưởng"/>
+      <w:r>
+        <w:t>Bước 1: Ý tưởng</w:t>
+      </w:r>
+    </w:p>
+    <w:p>
+      <w:pPr>
+        <w:pStyle w:val="Compact"/>
+        <w:numPr>
+          <w:ilvl w:val="0"/>
+          <w:numId w:val="18"/>
+        </w:numPr>
+      </w:pPr>
+      <w:r>
+        <w:t xml:space="preserve">Ta muốn </w:t>
+      </w:r>
+      <w:r>
+        <w:rPr>
+          <w:b/>
+          <w:bCs/>
+        </w:rPr>
+        <w:t>tìm mối quan hệ</w:t>
+      </w:r>
+      <w:r>
+        <w:t>: khi học nhiều hơn, điểm có tăng không?</w:t>
+      </w:r>
+    </w:p>
+    <w:p>
+      <w:pPr>
+        <w:pStyle w:val="Compact"/>
+        <w:numPr>
+          <w:ilvl w:val="0"/>
+          <w:numId w:val="18"/>
+        </w:numPr>
+      </w:pPr>
+    </w:p>
+    <w:p>
+      <w:pPr>
+        <w:pStyle w:val="Compact"/>
+        <w:numPr>
+          <w:ilvl w:val="0"/>
+          <w:numId w:val="18"/>
+        </w:numPr>
+      </w:pPr>
+      <w:r>
+        <w:t xml:space="preserve">Dạng phương trình: </w:t>
+      </w:r>
+      <w:r>
+        <w:drawing>
+          <wp:inline distT="0" distB="0" distL="0" distR="0" wp14:anchorId="0FA46059" wp14:editId="3010FA12">
+            <wp:extent cx="2295845" cy="752580"/>
+            <wp:effectExtent l="0" t="0" r="9525" b="9525"/>
+            <wp:docPr id="9" name="Picture 9"/>
+            <wp:cNvGraphicFramePr>
+              <a:graphicFrameLocks xmlns:a="http://schemas.openxmlformats.org/drawingml/2006/main" noChangeAspect="1"/>
+            </wp:cNvGraphicFramePr>
+            <a:graphic xmlns:a="http://schemas.openxmlformats.org/drawingml/2006/main">
+              <a:graphicData uri="http://schemas.openxmlformats.org/drawingml/2006/picture">
+                <pic:pic xmlns:pic="http://schemas.openxmlformats.org/drawingml/2006/picture">
+                  <pic:nvPicPr>
+                    <pic:cNvPr id="1" name=""/>
+                    <pic:cNvPicPr/>
+                  </pic:nvPicPr>
+                  <pic:blipFill>
+                    <a:blip r:embed="rId17"/>
+                    <a:stretch>
+                      <a:fillRect/>
+                    </a:stretch>
+                  </pic:blipFill>
+                  <pic:spPr>
+                    <a:xfrm>
+                      <a:off x="0" y="0"/>
+                      <a:ext cx="2295845" cy="752580"/>
+                    </a:xfrm>
+                    <a:prstGeom prst="rect">
+                      <a:avLst/>
+                    </a:prstGeom>
+                  </pic:spPr>
+                </pic:pic>
+              </a:graphicData>
+            </a:graphic>
+          </wp:inline>
+        </w:drawing>
+      </w:r>
+      <w:r>
+        <w:t>Trong đó:</w:t>
+      </w:r>
+    </w:p>
+    <w:p>
+      <w:pPr>
+        <w:pStyle w:val="Compact"/>
+        <w:numPr>
+          <w:ilvl w:val="0"/>
+          <w:numId w:val="18"/>
+        </w:numPr>
+      </w:pPr>
+      <w:r>
+        <w:t>(b): độ dốc → mỗi giờ học thêm thì điểm tăng bao nhiêu.</w:t>
+      </w:r>
+    </w:p>
+    <w:p>
+      <w:pPr>
+        <w:pStyle w:val="Compact"/>
+        <w:numPr>
+          <w:ilvl w:val="0"/>
+          <w:numId w:val="18"/>
+        </w:numPr>
+      </w:pPr>
+      <w:r>
+        <w:t>(a): điểm dự đoán nếu không học gì (x=0).</w:t>
+      </w:r>
+    </w:p>
+    <w:p>
+      <w:r>
+        <w:pict w14:anchorId="1ED24C6A">
+          <v:rect id="_x0000_i1037" style="width:0;height:1.5pt" o:hralign="center" o:hrstd="t" o:hr="t"/>
+        </w:pict>
+      </w:r>
+    </w:p>
+    <w:p>
+      <w:pPr>
+        <w:pStyle w:val="Heading3"/>
+      </w:pPr>
+      <w:bookmarkStart w:id="18" w:name="bước-2-tính-các-giá-trị-cơ-bản"/>
+      <w:bookmarkEnd w:id="17"/>
+      <w:r>
+        <w:t>Bước 2: Tính các giá trị cơ bản</w:t>
+      </w:r>
+    </w:p>
+    <w:p>
+      <w:pPr>
+        <w:pStyle w:val="BlockText"/>
+      </w:pPr>
+      <w:r>
+        <w:lastRenderedPageBreak/>
+        <w:drawing>
+          <wp:inline distT="0" distB="0" distL="0" distR="0" wp14:anchorId="47E28A40" wp14:editId="633F1D89">
+            <wp:extent cx="5943600" cy="1913890"/>
+            <wp:effectExtent l="0" t="0" r="0" b="0"/>
+            <wp:docPr id="10" name="Picture 10"/>
+            <wp:cNvGraphicFramePr>
+              <a:graphicFrameLocks xmlns:a="http://schemas.openxmlformats.org/drawingml/2006/main" noChangeAspect="1"/>
+            </wp:cNvGraphicFramePr>
+            <a:graphic xmlns:a="http://schemas.openxmlformats.org/drawingml/2006/main">
+              <a:graphicData uri="http://schemas.openxmlformats.org/drawingml/2006/picture">
+                <pic:pic xmlns:pic="http://schemas.openxmlformats.org/drawingml/2006/picture">
+                  <pic:nvPicPr>
+                    <pic:cNvPr id="1" name=""/>
+                    <pic:cNvPicPr/>
+                  </pic:nvPicPr>
+                  <pic:blipFill>
+                    <a:blip r:embed="rId18"/>
+                    <a:stretch>
+                      <a:fillRect/>
+                    </a:stretch>
+                  </pic:blipFill>
+                  <pic:spPr>
+                    <a:xfrm>
+                      <a:off x="0" y="0"/>
+                      <a:ext cx="5943600" cy="1913890"/>
+                    </a:xfrm>
+                    <a:prstGeom prst="rect">
+                      <a:avLst/>
+                    </a:prstGeom>
+                  </pic:spPr>
+                </pic:pic>
+              </a:graphicData>
+            </a:graphic>
+          </wp:inline>
+        </w:drawing>
+      </w:r>
+      <w:r>
+        <w:t xml:space="preserve">Mỗi giờ học thêm giúp tăng khoảng </w:t>
+      </w:r>
+      <w:r>
+        <w:rPr>
+          <w:b/>
+          <w:bCs/>
+        </w:rPr>
+        <w:t>9.13 điểm</w:t>
+      </w:r>
+      <w:r>
+        <w:t xml:space="preserve"> trung bình.</w:t>
+      </w:r>
+    </w:p>
+    <w:p>
+      <w:r>
+        <w:pict w14:anchorId="04CA3F40">
+          <v:rect id="_x0000_i1038" style="width:0;height:1.5pt" o:hralign="center" o:hrstd="t" o:hr="t"/>
+        </w:pict>
+      </w:r>
+    </w:p>
+    <w:p>
+      <w:pPr>
+        <w:pStyle w:val="Heading3"/>
+      </w:pPr>
+      <w:bookmarkStart w:id="19" w:name="bước-3-hệ-số-xác-định-r2"/>
+      <w:bookmarkEnd w:id="18"/>
+      <w:r>
+        <w:t>Bước 3: Hệ số xác định (R^2)</w:t>
+      </w:r>
+    </w:p>
+    <w:p>
+      <w:pPr>
+        <w:pStyle w:val="FirstParagraph"/>
+      </w:pPr>
+      <w:r>
+        <w:t xml:space="preserve">Nó cho biết </w:t>
+      </w:r>
+      <w:r>
+        <w:rPr>
+          <w:b/>
+          <w:bCs/>
+        </w:rPr>
+        <w:t>mức độ “phù hợp” của đường thẳng với dữ liệu</w:t>
+      </w:r>
+      <w:r>
+        <w:t>. (R^2 = 0.95)</w:t>
+      </w:r>
+      <w:r>
+        <w:rPr>
+          <w:noProof/>
+        </w:rPr>
+        <w:t xml:space="preserve"> </w:t>
+      </w:r>
+      <w:r>
+        <w:drawing>
+          <wp:inline distT="0" distB="0" distL="0" distR="0" wp14:anchorId="6144B8A5" wp14:editId="246C8615">
+            <wp:extent cx="4810796" cy="600159"/>
+            <wp:effectExtent l="0" t="0" r="0" b="9525"/>
+            <wp:docPr id="11" name="Picture 11"/>
+            <wp:cNvGraphicFramePr>
+              <a:graphicFrameLocks xmlns:a="http://schemas.openxmlformats.org/drawingml/2006/main" noChangeAspect="1"/>
+            </wp:cNvGraphicFramePr>
+            <a:graphic xmlns:a="http://schemas.openxmlformats.org/drawingml/2006/main">
+              <a:graphicData uri="http://schemas.openxmlformats.org/drawingml/2006/picture">
+                <pic:pic xmlns:pic="http://schemas.openxmlformats.org/drawingml/2006/picture">
+                  <pic:nvPicPr>
+                    <pic:cNvPr id="1" name=""/>
+                    <pic:cNvPicPr/>
+                  </pic:nvPicPr>
+                  <pic:blipFill>
+                    <a:blip r:embed="rId19"/>
+                    <a:stretch>
+                      <a:fillRect/>
+                    </a:stretch>
+                  </pic:blipFill>
+                  <pic:spPr>
+                    <a:xfrm>
+                      <a:off x="0" y="0"/>
+                      <a:ext cx="4810796" cy="600159"/>
+                    </a:xfrm>
+                    <a:prstGeom prst="rect">
+                      <a:avLst/>
+                    </a:prstGeom>
+                  </pic:spPr>
+                </pic:pic>
+              </a:graphicData>
+            </a:graphic>
+          </wp:inline>
+        </w:drawing>
+      </w:r>
+    </w:p>
+    <w:p>
+      <w:pPr>
+        <w:pStyle w:val="BodyText"/>
+      </w:pPr>
+      <w:r>
+        <w:rPr>
+          <w:rFonts w:ascii="Segoe UI Symbol" w:hAnsi="Segoe UI Symbol" w:cs="Segoe UI Symbol"/>
+        </w:rPr>
+        <w:t>👉</w:t>
+      </w:r>
+      <w:r>
+        <w:t xml:space="preserve"> Nghĩa là </w:t>
+      </w:r>
+      <w:r>
+        <w:rPr>
+          <w:b/>
+          <w:bCs/>
+        </w:rPr>
+        <w:t>95% sự thay đổi điểm số được giải thích bởi số giờ học</w:t>
+      </w:r>
+      <w:r>
+        <w:t>.</w:t>
+      </w:r>
+    </w:p>
+    <w:p>
+      <w:pPr>
+        <w:pStyle w:val="BlockText"/>
+      </w:pPr>
+      <w:r>
+        <w:t xml:space="preserve">Nói dễ hiểu: học càng nhiều thì điểm gần như chắc chắn cao hơn — mối quan hệ rất mạnh </w:t>
+      </w:r>
+      <w:r>
+        <w:rPr>
+          <w:rFonts w:ascii="Segoe UI Symbol" w:hAnsi="Segoe UI Symbol" w:cs="Segoe UI Symbol"/>
+        </w:rPr>
+        <w:t>💪</w:t>
+      </w:r>
+    </w:p>
+    <w:p>
+      <w:r>
+        <w:pict w14:anchorId="5DE92B54">
+          <v:rect id="_x0000_i1039" style="width:0;height:1.5pt" o:hralign="center" o:hrstd="t" o:hr="t"/>
+        </w:pict>
+      </w:r>
+    </w:p>
+    <w:p>
+      <w:pPr>
+        <w:pStyle w:val="Heading1"/>
+      </w:pPr>
+      <w:bookmarkStart w:id="20" w:name="tổng-kết-dễ-hiểu"/>
+      <w:bookmarkEnd w:id="16"/>
+      <w:bookmarkEnd w:id="19"/>
+      <w:r>
+        <w:rPr>
+          <w:rFonts w:ascii="Segoe UI Symbol" w:hAnsi="Segoe UI Symbol" w:cs="Segoe UI Symbol"/>
+        </w:rPr>
+        <w:t>✅</w:t>
+      </w:r>
+      <w:r>
+        <w:t xml:space="preserve"> </w:t>
+      </w:r>
+      <w:r>
+        <w:rPr>
+          <w:b/>
+          <w:bCs/>
+        </w:rPr>
+        <w:t>Tổng kết dễ hiểu</w:t>
+      </w:r>
+    </w:p>
+    <w:tbl>
+      <w:tblPr>
+        <w:tblStyle w:val="Table"/>
+        <w:tblW w:w="5000" w:type="pct"/>
+        <w:tblBorders>
+          <w:top w:val="single" w:sz="4" w:space="0" w:color="auto"/>
+          <w:left w:val="single" w:sz="4" w:space="0" w:color="auto"/>
+          <w:bottom w:val="single" w:sz="4" w:space="0" w:color="auto"/>
+          <w:right w:val="single" w:sz="4" w:space="0" w:color="auto"/>
+          <w:insideH w:val="single" w:sz="4" w:space="0" w:color="auto"/>
+          <w:insideV w:val="single" w:sz="4" w:space="0" w:color="auto"/>
+        </w:tblBorders>
+        <w:tblLayout w:type="fixed"/>
+        <w:tblLook w:val="0020" w:firstRow="1" w:lastRow="0" w:firstColumn="0" w:lastColumn="0" w:noHBand="0" w:noVBand="0"/>
+      </w:tblPr>
+      <w:tblGrid>
+        <w:gridCol w:w="279"/>
+        <w:gridCol w:w="816"/>
+        <w:gridCol w:w="8255"/>
+      </w:tblGrid>
+      <w:tr>
+        <w:trPr>
+          <w:cnfStyle w:val="100000000000" w:firstRow="1" w:lastRow="0" w:firstColumn="0" w:lastColumn="0" w:oddVBand="0" w:evenVBand="0" w:oddHBand="0" w:evenHBand="0" w:firstRowFirstColumn="0" w:firstRowLastColumn="0" w:lastRowFirstColumn="0" w:lastRowLastColumn="0"/>
+          <w:tblHeader/>
+        </w:trPr>
+        <w:tc>
+          <w:tcPr>
+            <w:tcW w:w="230" w:type="dxa"/>
+            <w:tcBorders>
+              <w:bottom w:val="none" w:sz="0" w:space="0" w:color="auto"/>
+            </w:tcBorders>
+          </w:tcPr>
+          <w:p>
+            <w:pPr>
+              <w:pStyle w:val="Compact"/>
+              <w:jc w:val="center"/>
+            </w:pPr>
+            <w:r>
+              <w:t>Câu</w:t>
+            </w:r>
+          </w:p>
+        </w:tc>
+        <w:tc>
+          <w:tcPr>
+            <w:tcW w:w="692" w:type="dxa"/>
+            <w:tcBorders>
+              <w:bottom w:val="none" w:sz="0" w:space="0" w:color="auto"/>
+            </w:tcBorders>
+          </w:tcPr>
+          <w:p>
+            <w:pPr>
+              <w:pStyle w:val="Compact"/>
+            </w:pPr>
+            <w:r>
+              <w:t>Chủ đề</w:t>
+            </w:r>
+          </w:p>
+        </w:tc>
+        <w:tc>
+          <w:tcPr>
+            <w:tcW w:w="6997" w:type="dxa"/>
+            <w:tcBorders>
+              <w:bottom w:val="none" w:sz="0" w:space="0" w:color="auto"/>
+            </w:tcBorders>
+          </w:tcPr>
+          <w:p>
+            <w:pPr>
+              <w:pStyle w:val="Compact"/>
+            </w:pPr>
+            <w:r>
+              <w:t>Kết luận ngắn gọn</w:t>
+            </w:r>
+          </w:p>
+        </w:tc>
+      </w:tr>
+      <w:tr>
+        <w:tc>
+          <w:tcPr>
+            <w:tcW w:w="230" w:type="dxa"/>
+          </w:tcPr>
+          <w:p>
+            <w:pPr>
+              <w:pStyle w:val="Compact"/>
+              <w:jc w:val="center"/>
+            </w:pPr>
+            <w:r>
+              <w:t>1</w:t>
+            </w:r>
+          </w:p>
+        </w:tc>
+        <w:tc>
+          <w:tcPr>
+            <w:tcW w:w="692" w:type="dxa"/>
+          </w:tcPr>
+          <w:p>
+            <w:pPr>
+              <w:pStyle w:val="Compact"/>
+            </w:pPr>
+            <w:r>
+              <w:t>Ước lượng</w:t>
+            </w:r>
+          </w:p>
+        </w:tc>
+        <w:tc>
+          <w:tcPr>
+            <w:tcW w:w="6997" w:type="dxa"/>
+          </w:tcPr>
+          <w:p>
+            <w:pPr>
+              <w:pStyle w:val="Compact"/>
+            </w:pPr>
+            <w:r>
+              <w:t>Trung bình cao tốc 49.73 mpg; khoảng ước lượng hỗn hợp (44.39–45.79); hiệu suất cao 30–90%.</w:t>
+            </w:r>
+          </w:p>
+        </w:tc>
+      </w:tr>
+      <w:tr>
+        <w:tc>
+          <w:tcPr>
+            <w:tcW w:w="230" w:type="dxa"/>
+          </w:tcPr>
+          <w:p>
+            <w:pPr>
+              <w:pStyle w:val="Compact"/>
+              <w:jc w:val="center"/>
+            </w:pPr>
+            <w:r>
+              <w:t>2</w:t>
+            </w:r>
+          </w:p>
+        </w:tc>
+        <w:tc>
+          <w:tcPr>
+            <w:tcW w:w="692" w:type="dxa"/>
+          </w:tcPr>
+          <w:p>
+            <w:pPr>
+              <w:pStyle w:val="Compact"/>
+            </w:pPr>
+            <w:r>
+              <w:t>Kiểm định</w:t>
+            </w:r>
+          </w:p>
+        </w:tc>
+        <w:tc>
+          <w:tcPr>
+            <w:tcW w:w="6997" w:type="dxa"/>
+          </w:tcPr>
+          <w:p>
+            <w:pPr>
+              <w:pStyle w:val="Compact"/>
+            </w:pPr>
+            <w:r>
+              <w:t>Thời gian ~120 phút; chi tiêu ~500 nghìn; chưa chắc &gt; 60% người mua qua điện thoại.</w:t>
+            </w:r>
+          </w:p>
+        </w:tc>
+      </w:tr>
+      <w:tr>
+        <w:tc>
+          <w:tcPr>
+            <w:tcW w:w="230" w:type="dxa"/>
+          </w:tcPr>
+          <w:p>
+            <w:pPr>
+              <w:pStyle w:val="Compact"/>
+              <w:jc w:val="center"/>
+            </w:pPr>
+            <w:r>
+              <w:t>3</w:t>
+            </w:r>
+          </w:p>
+        </w:tc>
+        <w:tc>
+          <w:tcPr>
+            <w:tcW w:w="692" w:type="dxa"/>
+          </w:tcPr>
+          <w:p>
+            <w:pPr>
+              <w:pStyle w:val="Compact"/>
+            </w:pPr>
+            <w:r>
+              <w:t>Hồi quy</w:t>
+            </w:r>
+          </w:p>
+        </w:tc>
+        <w:tc>
+          <w:tcPr>
+            <w:tcW w:w="6997" w:type="dxa"/>
+          </w:tcPr>
+          <w:p>
+            <w:pPr>
+              <w:pStyle w:val="Compact"/>
+            </w:pPr>
+            <w:r>
+              <w:t>Mỗi giờ học tăng ~9 điểm; 95% điểm số giải thích bởi giờ học.</w:t>
+            </w:r>
+          </w:p>
+        </w:tc>
+      </w:tr>
+      <w:bookmarkEnd w:id="20"/>
+    </w:tbl>
+    <w:p/>
+    <w:p/>
     <w:sectPr>
-      <w:headerReference w:type="default" r:id="rId9"/>
+      <w:headerReference w:type="default" r:id="rId20"/>
       <w:pgSz w:w="12240" w:h="15840"/>
       <w:pgMar w:top="1170" w:right="1440" w:bottom="1440" w:left="1440" w:header="720" w:footer="720" w:gutter="0"/>
       <w:cols w:space="720"/>
@@ -3568,7 +5338,7 @@
 </file>
 
 <file path=word/endnotes.xml><?xml version="1.0" encoding="utf-8"?>
-<w:endnotes xmlns:wpc="http://schemas.microsoft.com/office/word/2010/wordprocessingCanvas" xmlns:cx="http://schemas.microsoft.com/office/drawing/2014/chartex" xmlns:cx1="http://schemas.microsoft.com/office/drawing/2015/9/8/chartex" xmlns:cx2="http://schemas.microsoft.com/office/drawing/2015/10/21/chartex" xmlns:cx3="http://schemas.microsoft.com/office/drawing/2016/5/9/chartex" xmlns:cx4="http://schemas.microsoft.com/office/drawing/2016/5/10/chartex" xmlns:cx5="http://schemas.microsoft.com/office/drawing/2016/5/11/chartex" xmlns:cx6="http://schemas.microsoft.com/office/drawing/2016/5/12/chartex" xmlns:cx7="http://schemas.microsoft.com/office/drawing/2016/5/13/chartex" xmlns:cx8="http://schemas.microsoft.com/office/drawing/2016/5/14/chartex" xmlns:mc="http://schemas.openxmlformats.org/markup-compatibility/2006" xmlns:aink="http://schemas.microsoft.com/office/drawing/2016/ink" xmlns:am3d="http://schemas.microsoft.com/office/drawing/2017/model3d" xmlns:o="urn:schemas-microsoft-com:office:office" xmlns:oel="http://schemas.microsoft.com/office/2019/extlst" xmlns:r="http://schemas.openxmlformats.org/officeDocument/2006/relationships" xmlns:m="http://schemas.openxmlformats.org/officeDocument/2006/math" xmlns:v="urn:schemas-microsoft-com:vml" xmlns:wp14="http://schemas.microsoft.com/office/word/2010/wordprocessingDrawing" xmlns:wp="http://schemas.openxmlformats.org/drawingml/2006/wordprocessingDrawing" xmlns:w10="urn:schemas-microsoft-com:office:word" xmlns:w="http://schemas.openxmlformats.org/wordprocessingml/2006/main" xmlns:w14="http://schemas.microsoft.com/office/word/2010/wordml" xmlns:w15="http://schemas.microsoft.com/office/word/2012/wordml" xmlns:w16cex="http://schemas.microsoft.com/office/word/2018/wordml/cex" xmlns:w16cid="http://schemas.microsoft.com/office/word/2016/wordml/cid" xmlns:w16="http://schemas.microsoft.com/office/word/2018/wordml" xmlns:w16du="http://schemas.microsoft.com/office/word/2023/wordml/word16du" xmlns:w16sdtdh="http://schemas.microsoft.com/office/word/2020/wordml/sdtdatahash" xmlns:w16sdtfl="http://schemas.microsoft.com/office/word/2024/wordml/sdtformatlock" xmlns:w16se="http://schemas.microsoft.com/office/word/2015/wordml/symex" xmlns:wpg="http://schemas.microsoft.com/office/word/2010/wordprocessingGroup" xmlns:wpi="http://schemas.microsoft.com/office/word/2010/wordprocessingInk" xmlns:wne="http://schemas.microsoft.com/office/word/2006/wordml" xmlns:wps="http://schemas.microsoft.com/office/word/2010/wordprocessingShape" mc:Ignorable="w14 w15 w16se w16cid w16 w16cex w16sdtdh w16sdtfl w16du wp14">
+<w:endnotes xmlns:wpc="http://schemas.microsoft.com/office/word/2010/wordprocessingCanvas" xmlns:mc="http://schemas.openxmlformats.org/markup-compatibility/2006" xmlns:o="urn:schemas-microsoft-com:office:office" xmlns:r="http://schemas.openxmlformats.org/officeDocument/2006/relationships" xmlns:m="http://schemas.openxmlformats.org/officeDocument/2006/math" xmlns:v="urn:schemas-microsoft-com:vml" xmlns:wp14="http://schemas.microsoft.com/office/word/2010/wordprocessingDrawing" xmlns:wp="http://schemas.openxmlformats.org/drawingml/2006/wordprocessingDrawing" xmlns:w10="urn:schemas-microsoft-com:office:word" xmlns:w="http://schemas.openxmlformats.org/wordprocessingml/2006/main" xmlns:w14="http://schemas.microsoft.com/office/word/2010/wordml" xmlns:w15="http://schemas.microsoft.com/office/word/2012/wordml" xmlns:wpg="http://schemas.microsoft.com/office/word/2010/wordprocessingGroup" xmlns:wpi="http://schemas.microsoft.com/office/word/2010/wordprocessingInk" xmlns:wne="http://schemas.microsoft.com/office/word/2006/wordml" xmlns:wps="http://schemas.microsoft.com/office/word/2010/wordprocessingShape" mc:Ignorable="w14 w15 wp14">
   <w:endnote w:type="separator" w:id="-1">
     <w:p>
       <w:r>
@@ -3587,7 +5357,7 @@
 </file>
 
 <file path=word/footnotes.xml><?xml version="1.0" encoding="utf-8"?>
-<w:footnotes xmlns:wpc="http://schemas.microsoft.com/office/word/2010/wordprocessingCanvas" xmlns:cx="http://schemas.microsoft.com/office/drawing/2014/chartex" xmlns:cx1="http://schemas.microsoft.com/office/drawing/2015/9/8/chartex" xmlns:cx2="http://schemas.microsoft.com/office/drawing/2015/10/21/chartex" xmlns:cx3="http://schemas.microsoft.com/office/drawing/2016/5/9/chartex" xmlns:cx4="http://schemas.microsoft.com/office/drawing/2016/5/10/chartex" xmlns:cx5="http://schemas.microsoft.com/office/drawing/2016/5/11/chartex" xmlns:cx6="http://schemas.microsoft.com/office/drawing/2016/5/12/chartex" xmlns:cx7="http://schemas.microsoft.com/office/drawing/2016/5/13/chartex" xmlns:cx8="http://schemas.microsoft.com/office/drawing/2016/5/14/chartex" xmlns:mc="http://schemas.openxmlformats.org/markup-compatibility/2006" xmlns:aink="http://schemas.microsoft.com/office/drawing/2016/ink" xmlns:am3d="http://schemas.microsoft.com/office/drawing/2017/model3d" xmlns:o="urn:schemas-microsoft-com:office:office" xmlns:oel="http://schemas.microsoft.com/office/2019/extlst" xmlns:r="http://schemas.openxmlformats.org/officeDocument/2006/relationships" xmlns:m="http://schemas.openxmlformats.org/officeDocument/2006/math" xmlns:v="urn:schemas-microsoft-com:vml" xmlns:wp14="http://schemas.microsoft.com/office/word/2010/wordprocessingDrawing" xmlns:wp="http://schemas.openxmlformats.org/drawingml/2006/wordprocessingDrawing" xmlns:w10="urn:schemas-microsoft-com:office:word" xmlns:w="http://schemas.openxmlformats.org/wordprocessingml/2006/main" xmlns:w14="http://schemas.microsoft.com/office/word/2010/wordml" xmlns:w15="http://schemas.microsoft.com/office/word/2012/wordml" xmlns:w16cex="http://schemas.microsoft.com/office/word/2018/wordml/cex" xmlns:w16cid="http://schemas.microsoft.com/office/word/2016/wordml/cid" xmlns:w16="http://schemas.microsoft.com/office/word/2018/wordml" xmlns:w16du="http://schemas.microsoft.com/office/word/2023/wordml/word16du" xmlns:w16sdtdh="http://schemas.microsoft.com/office/word/2020/wordml/sdtdatahash" xmlns:w16sdtfl="http://schemas.microsoft.com/office/word/2024/wordml/sdtformatlock" xmlns:w16se="http://schemas.microsoft.com/office/word/2015/wordml/symex" xmlns:wpg="http://schemas.microsoft.com/office/word/2010/wordprocessingGroup" xmlns:wpi="http://schemas.microsoft.com/office/word/2010/wordprocessingInk" xmlns:wne="http://schemas.microsoft.com/office/word/2006/wordml" xmlns:wps="http://schemas.microsoft.com/office/word/2010/wordprocessingShape" mc:Ignorable="w14 w15 w16se w16cid w16 w16cex w16sdtdh w16sdtfl w16du wp14">
+<w:footnotes xmlns:wpc="http://schemas.microsoft.com/office/word/2010/wordprocessingCanvas" xmlns:mc="http://schemas.openxmlformats.org/markup-compatibility/2006" xmlns:o="urn:schemas-microsoft-com:office:office" xmlns:r="http://schemas.openxmlformats.org/officeDocument/2006/relationships" xmlns:m="http://schemas.openxmlformats.org/officeDocument/2006/math" xmlns:v="urn:schemas-microsoft-com:vml" xmlns:wp14="http://schemas.microsoft.com/office/word/2010/wordprocessingDrawing" xmlns:wp="http://schemas.openxmlformats.org/drawingml/2006/wordprocessingDrawing" xmlns:w10="urn:schemas-microsoft-com:office:word" xmlns:w="http://schemas.openxmlformats.org/wordprocessingml/2006/main" xmlns:w14="http://schemas.microsoft.com/office/word/2010/wordml" xmlns:w15="http://schemas.microsoft.com/office/word/2012/wordml" xmlns:wpg="http://schemas.microsoft.com/office/word/2010/wordprocessingGroup" xmlns:wpi="http://schemas.microsoft.com/office/word/2010/wordprocessingInk" xmlns:wne="http://schemas.microsoft.com/office/word/2006/wordml" xmlns:wps="http://schemas.microsoft.com/office/word/2010/wordprocessingShape" mc:Ignorable="w14 w15 wp14">
   <w:footnote w:type="separator" w:id="-1">
     <w:p>
       <w:r>
@@ -3606,7 +5376,7 @@
 </file>
 
 <file path=word/header1.xml><?xml version="1.0" encoding="utf-8"?>
-<w:hdr xmlns:wpc="http://schemas.microsoft.com/office/word/2010/wordprocessingCanvas" xmlns:cx="http://schemas.microsoft.com/office/drawing/2014/chartex" xmlns:cx1="http://schemas.microsoft.com/office/drawing/2015/9/8/chartex" xmlns:cx2="http://schemas.microsoft.com/office/drawing/2015/10/21/chartex" xmlns:cx3="http://schemas.microsoft.com/office/drawing/2016/5/9/chartex" xmlns:cx4="http://schemas.microsoft.com/office/drawing/2016/5/10/chartex" xmlns:cx5="http://schemas.microsoft.com/office/drawing/2016/5/11/chartex" xmlns:cx6="http://schemas.microsoft.com/office/drawing/2016/5/12/chartex" xmlns:cx7="http://schemas.microsoft.com/office/drawing/2016/5/13/chartex" xmlns:cx8="http://schemas.microsoft.com/office/drawing/2016/5/14/chartex" xmlns:mc="http://schemas.openxmlformats.org/markup-compatibility/2006" xmlns:aink="http://schemas.microsoft.com/office/drawing/2016/ink" xmlns:am3d="http://schemas.microsoft.com/office/drawing/2017/model3d" xmlns:o="urn:schemas-microsoft-com:office:office" xmlns:oel="http://schemas.microsoft.com/office/2019/extlst" xmlns:r="http://schemas.openxmlformats.org/officeDocument/2006/relationships" xmlns:m="http://schemas.openxmlformats.org/officeDocument/2006/math" xmlns:v="urn:schemas-microsoft-com:vml" xmlns:wp14="http://schemas.microsoft.com/office/word/2010/wordprocessingDrawing" xmlns:wp="http://schemas.openxmlformats.org/drawingml/2006/wordprocessingDrawing" xmlns:w10="urn:schemas-microsoft-com:office:word" xmlns:w="http://schemas.openxmlformats.org/wordprocessingml/2006/main" xmlns:w14="http://schemas.microsoft.com/office/word/2010/wordml" xmlns:w15="http://schemas.microsoft.com/office/word/2012/wordml" xmlns:w16cex="http://schemas.microsoft.com/office/word/2018/wordml/cex" xmlns:w16cid="http://schemas.microsoft.com/office/word/2016/wordml/cid" xmlns:w16="http://schemas.microsoft.com/office/word/2018/wordml" xmlns:w16du="http://schemas.microsoft.com/office/word/2023/wordml/word16du" xmlns:w16sdtdh="http://schemas.microsoft.com/office/word/2020/wordml/sdtdatahash" xmlns:w16sdtfl="http://schemas.microsoft.com/office/word/2024/wordml/sdtformatlock" xmlns:w16se="http://schemas.microsoft.com/office/word/2015/wordml/symex" xmlns:wpg="http://schemas.microsoft.com/office/word/2010/wordprocessingGroup" xmlns:wpi="http://schemas.microsoft.com/office/word/2010/wordprocessingInk" xmlns:wne="http://schemas.microsoft.com/office/word/2006/wordml" xmlns:wps="http://schemas.microsoft.com/office/word/2010/wordprocessingShape" mc:Ignorable="w14 w15 w16se w16cid w16 w16cex w16sdtdh w16sdtfl w16du wp14">
+<w:hdr xmlns:wpc="http://schemas.microsoft.com/office/word/2010/wordprocessingCanvas" xmlns:mc="http://schemas.openxmlformats.org/markup-compatibility/2006" xmlns:o="urn:schemas-microsoft-com:office:office" xmlns:r="http://schemas.openxmlformats.org/officeDocument/2006/relationships" xmlns:m="http://schemas.openxmlformats.org/officeDocument/2006/math" xmlns:v="urn:schemas-microsoft-com:vml" xmlns:wp14="http://schemas.microsoft.com/office/word/2010/wordprocessingDrawing" xmlns:wp="http://schemas.openxmlformats.org/drawingml/2006/wordprocessingDrawing" xmlns:w10="urn:schemas-microsoft-com:office:word" xmlns:w="http://schemas.openxmlformats.org/wordprocessingml/2006/main" xmlns:w14="http://schemas.microsoft.com/office/word/2010/wordml" xmlns:w15="http://schemas.microsoft.com/office/word/2012/wordml" xmlns:wpg="http://schemas.microsoft.com/office/word/2010/wordprocessingGroup" xmlns:wpi="http://schemas.microsoft.com/office/word/2010/wordprocessingInk" xmlns:wne="http://schemas.microsoft.com/office/word/2006/wordml" xmlns:wps="http://schemas.microsoft.com/office/word/2010/wordprocessingShape" mc:Ignorable="w14 w15 wp14">
   <w:p>
     <w:pPr>
       <w:ind w:left="5040" w:right="-240" w:firstLine="720"/>
@@ -3621,8 +5391,85 @@
 </file>
 
 <file path=word/numbering.xml><?xml version="1.0" encoding="utf-8"?>
-<w:numbering xmlns:wpc="http://schemas.microsoft.com/office/word/2010/wordprocessingCanvas" xmlns:cx="http://schemas.microsoft.com/office/drawing/2014/chartex" xmlns:cx1="http://schemas.microsoft.com/office/drawing/2015/9/8/chartex" xmlns:cx2="http://schemas.microsoft.com/office/drawing/2015/10/21/chartex" xmlns:cx3="http://schemas.microsoft.com/office/drawing/2016/5/9/chartex" xmlns:cx4="http://schemas.microsoft.com/office/drawing/2016/5/10/chartex" xmlns:cx5="http://schemas.microsoft.com/office/drawing/2016/5/11/chartex" xmlns:cx6="http://schemas.microsoft.com/office/drawing/2016/5/12/chartex" xmlns:cx7="http://schemas.microsoft.com/office/drawing/2016/5/13/chartex" xmlns:cx8="http://schemas.microsoft.com/office/drawing/2016/5/14/chartex" xmlns:mc="http://schemas.openxmlformats.org/markup-compatibility/2006" xmlns:aink="http://schemas.microsoft.com/office/drawing/2016/ink" xmlns:am3d="http://schemas.microsoft.com/office/drawing/2017/model3d" xmlns:o="urn:schemas-microsoft-com:office:office" xmlns:oel="http://schemas.microsoft.com/office/2019/extlst" xmlns:r="http://schemas.openxmlformats.org/officeDocument/2006/relationships" xmlns:m="http://schemas.openxmlformats.org/officeDocument/2006/math" xmlns:v="urn:schemas-microsoft-com:vml" xmlns:wp14="http://schemas.microsoft.com/office/word/2010/wordprocessingDrawing" xmlns:wp="http://schemas.openxmlformats.org/drawingml/2006/wordprocessingDrawing" xmlns:w10="urn:schemas-microsoft-com:office:word" xmlns:w="http://schemas.openxmlformats.org/wordprocessingml/2006/main" xmlns:w14="http://schemas.microsoft.com/office/word/2010/wordml" xmlns:w15="http://schemas.microsoft.com/office/word/2012/wordml" xmlns:w16cex="http://schemas.microsoft.com/office/word/2018/wordml/cex" xmlns:w16cid="http://schemas.microsoft.com/office/word/2016/wordml/cid" xmlns:w16="http://schemas.microsoft.com/office/word/2018/wordml" xmlns:w16du="http://schemas.microsoft.com/office/word/2023/wordml/word16du" xmlns:w16sdtdh="http://schemas.microsoft.com/office/word/2020/wordml/sdtdatahash" xmlns:w16sdtfl="http://schemas.microsoft.com/office/word/2024/wordml/sdtformatlock" xmlns:w16se="http://schemas.microsoft.com/office/word/2015/wordml/symex" xmlns:wpg="http://schemas.microsoft.com/office/word/2010/wordprocessingGroup" xmlns:wpi="http://schemas.microsoft.com/office/word/2010/wordprocessingInk" xmlns:wne="http://schemas.microsoft.com/office/word/2006/wordml" xmlns:wps="http://schemas.microsoft.com/office/word/2010/wordprocessingShape" mc:Ignorable="w14 w15 w16se w16cid w16 w16cex w16sdtdh w16sdtfl w16du wp14">
-  <w:abstractNum w:abstractNumId="0" w15:restartNumberingAfterBreak="0">
+<w:numbering xmlns:wpc="http://schemas.microsoft.com/office/word/2010/wordprocessingCanvas" xmlns:mc="http://schemas.openxmlformats.org/markup-compatibility/2006" xmlns:o="urn:schemas-microsoft-com:office:office" xmlns:r="http://schemas.openxmlformats.org/officeDocument/2006/relationships" xmlns:m="http://schemas.openxmlformats.org/officeDocument/2006/math" xmlns:v="urn:schemas-microsoft-com:vml" xmlns:wp14="http://schemas.microsoft.com/office/word/2010/wordprocessingDrawing" xmlns:wp="http://schemas.openxmlformats.org/drawingml/2006/wordprocessingDrawing" xmlns:w10="urn:schemas-microsoft-com:office:word" xmlns:w="http://schemas.openxmlformats.org/wordprocessingml/2006/main" xmlns:w14="http://schemas.microsoft.com/office/word/2010/wordml" xmlns:w15="http://schemas.microsoft.com/office/word/2012/wordml" xmlns:wpg="http://schemas.microsoft.com/office/word/2010/wordprocessingGroup" xmlns:wpi="http://schemas.microsoft.com/office/word/2010/wordprocessingInk" xmlns:wne="http://schemas.microsoft.com/office/word/2006/wordml" xmlns:wps="http://schemas.microsoft.com/office/word/2010/wordprocessingShape" mc:Ignorable="w14 w15 wp14">
+  <w:abstractNum w:abstractNumId="0">
+    <w:nsid w:val="0000A991"/>
+    <w:multiLevelType w:val="multilevel"/>
+    <w:tmpl w:val="8A2A0DD0"/>
+    <w:lvl w:ilvl="0">
+      <w:numFmt w:val="bullet"/>
+      <w:lvlText w:val="•"/>
+      <w:lvlJc w:val="left"/>
+      <w:pPr>
+        <w:ind w:left="720" w:hanging="480"/>
+      </w:pPr>
+    </w:lvl>
+    <w:lvl w:ilvl="1">
+      <w:numFmt w:val="bullet"/>
+      <w:lvlText w:val="–"/>
+      <w:lvlJc w:val="left"/>
+      <w:pPr>
+        <w:ind w:left="1440" w:hanging="480"/>
+      </w:pPr>
+    </w:lvl>
+    <w:lvl w:ilvl="2">
+      <w:numFmt w:val="bullet"/>
+      <w:lvlText w:val="•"/>
+      <w:lvlJc w:val="left"/>
+      <w:pPr>
+        <w:ind w:left="2160" w:hanging="480"/>
+      </w:pPr>
+    </w:lvl>
+    <w:lvl w:ilvl="3">
+      <w:numFmt w:val="bullet"/>
+      <w:lvlText w:val="–"/>
+      <w:lvlJc w:val="left"/>
+      <w:pPr>
+        <w:ind w:left="2880" w:hanging="480"/>
+      </w:pPr>
+    </w:lvl>
+    <w:lvl w:ilvl="4">
+      <w:numFmt w:val="bullet"/>
+      <w:lvlText w:val="•"/>
+      <w:lvlJc w:val="left"/>
+      <w:pPr>
+        <w:ind w:left="3600" w:hanging="480"/>
+      </w:pPr>
+    </w:lvl>
+    <w:lvl w:ilvl="5">
+      <w:numFmt w:val="bullet"/>
+      <w:lvlText w:val="–"/>
+      <w:lvlJc w:val="left"/>
+      <w:pPr>
+        <w:ind w:left="4320" w:hanging="480"/>
+      </w:pPr>
+    </w:lvl>
+    <w:lvl w:ilvl="6">
+      <w:numFmt w:val="bullet"/>
+      <w:lvlText w:val="•"/>
+      <w:lvlJc w:val="left"/>
+      <w:pPr>
+        <w:ind w:left="5040" w:hanging="480"/>
+      </w:pPr>
+    </w:lvl>
+    <w:lvl w:ilvl="7">
+      <w:numFmt w:val="bullet"/>
+      <w:lvlText w:val="–"/>
+      <w:lvlJc w:val="left"/>
+      <w:pPr>
+        <w:ind w:left="5760" w:hanging="480"/>
+      </w:pPr>
+    </w:lvl>
+    <w:lvl w:ilvl="8">
+      <w:numFmt w:val="bullet"/>
+      <w:lvlText w:val="•"/>
+      <w:lvlJc w:val="left"/>
+      <w:pPr>
+        <w:ind w:left="6480" w:hanging="480"/>
+      </w:pPr>
+    </w:lvl>
+  </w:abstractNum>
+  <w:abstractNum w:abstractNumId="1">
     <w:nsid w:val="0094593A"/>
     <w:multiLevelType w:val="hybridMultilevel"/>
     <w:tmpl w:val="AB5C64C0"/>
@@ -3735,7 +5582,7 @@
       </w:rPr>
     </w:lvl>
   </w:abstractNum>
-  <w:abstractNum w:abstractNumId="1" w15:restartNumberingAfterBreak="0">
+  <w:abstractNum w:abstractNumId="2">
     <w:nsid w:val="0153718A"/>
     <w:multiLevelType w:val="hybridMultilevel"/>
     <w:tmpl w:val="F49E02EA"/>
@@ -3821,7 +5668,7 @@
       </w:pPr>
     </w:lvl>
   </w:abstractNum>
-  <w:abstractNum w:abstractNumId="2" w15:restartNumberingAfterBreak="0">
+  <w:abstractNum w:abstractNumId="3">
     <w:nsid w:val="085C5FA4"/>
     <w:multiLevelType w:val="hybridMultilevel"/>
     <w:tmpl w:val="CEE6FEF6"/>
@@ -3907,7 +5754,7 @@
       </w:pPr>
     </w:lvl>
   </w:abstractNum>
-  <w:abstractNum w:abstractNumId="3" w15:restartNumberingAfterBreak="0">
+  <w:abstractNum w:abstractNumId="4">
     <w:nsid w:val="0AF45E38"/>
     <w:multiLevelType w:val="hybridMultilevel"/>
     <w:tmpl w:val="AA366744"/>
@@ -4020,7 +5867,7 @@
       </w:rPr>
     </w:lvl>
   </w:abstractNum>
-  <w:abstractNum w:abstractNumId="4" w15:restartNumberingAfterBreak="0">
+  <w:abstractNum w:abstractNumId="5">
     <w:nsid w:val="0C652EEB"/>
     <w:multiLevelType w:val="hybridMultilevel"/>
     <w:tmpl w:val="5E2EA0E4"/>
@@ -4106,7 +5953,7 @@
       </w:pPr>
     </w:lvl>
   </w:abstractNum>
-  <w:abstractNum w:abstractNumId="5" w15:restartNumberingAfterBreak="0">
+  <w:abstractNum w:abstractNumId="6">
     <w:nsid w:val="1B931EFA"/>
     <w:multiLevelType w:val="hybridMultilevel"/>
     <w:tmpl w:val="0E66AC12"/>
@@ -4192,7 +6039,7 @@
       </w:pPr>
     </w:lvl>
   </w:abstractNum>
-  <w:abstractNum w:abstractNumId="6" w15:restartNumberingAfterBreak="0">
+  <w:abstractNum w:abstractNumId="7">
     <w:nsid w:val="1D8071E8"/>
     <w:multiLevelType w:val="hybridMultilevel"/>
     <w:tmpl w:val="092C45E6"/>
@@ -4305,7 +6152,7 @@
       </w:rPr>
     </w:lvl>
   </w:abstractNum>
-  <w:abstractNum w:abstractNumId="7" w15:restartNumberingAfterBreak="0">
+  <w:abstractNum w:abstractNumId="8">
     <w:nsid w:val="3B4B6429"/>
     <w:multiLevelType w:val="hybridMultilevel"/>
     <w:tmpl w:val="9DECD01E"/>
@@ -4395,7 +6242,7 @@
       </w:pPr>
     </w:lvl>
   </w:abstractNum>
-  <w:abstractNum w:abstractNumId="8" w15:restartNumberingAfterBreak="0">
+  <w:abstractNum w:abstractNumId="9">
     <w:nsid w:val="44AF3A28"/>
     <w:multiLevelType w:val="hybridMultilevel"/>
     <w:tmpl w:val="4F4EE1C2"/>
@@ -4486,7 +6333,7 @@
       </w:pPr>
     </w:lvl>
   </w:abstractNum>
-  <w:abstractNum w:abstractNumId="9" w15:restartNumberingAfterBreak="0">
+  <w:abstractNum w:abstractNumId="10">
     <w:nsid w:val="50D835C0"/>
     <w:multiLevelType w:val="hybridMultilevel"/>
     <w:tmpl w:val="9782F736"/>
@@ -4577,7 +6424,7 @@
       </w:pPr>
     </w:lvl>
   </w:abstractNum>
-  <w:abstractNum w:abstractNumId="10" w15:restartNumberingAfterBreak="0">
+  <w:abstractNum w:abstractNumId="11">
     <w:nsid w:val="5B3C6339"/>
     <w:multiLevelType w:val="hybridMultilevel"/>
     <w:tmpl w:val="7DE2C702"/>
@@ -4689,7 +6536,7 @@
       </w:rPr>
     </w:lvl>
   </w:abstractNum>
-  <w:abstractNum w:abstractNumId="11" w15:restartNumberingAfterBreak="0">
+  <w:abstractNum w:abstractNumId="12">
     <w:nsid w:val="65A35F8A"/>
     <w:multiLevelType w:val="hybridMultilevel"/>
     <w:tmpl w:val="C814381A"/>
@@ -4779,7 +6626,7 @@
       </w:pPr>
     </w:lvl>
   </w:abstractNum>
-  <w:abstractNum w:abstractNumId="12" w15:restartNumberingAfterBreak="0">
+  <w:abstractNum w:abstractNumId="13">
     <w:nsid w:val="69BA4D33"/>
     <w:multiLevelType w:val="hybridMultilevel"/>
     <w:tmpl w:val="F13C11C6"/>
@@ -4865,7 +6712,7 @@
       </w:pPr>
     </w:lvl>
   </w:abstractNum>
-  <w:abstractNum w:abstractNumId="13" w15:restartNumberingAfterBreak="0">
+  <w:abstractNum w:abstractNumId="14">
     <w:nsid w:val="6BA9759E"/>
     <w:multiLevelType w:val="hybridMultilevel"/>
     <w:tmpl w:val="FE7EDEEA"/>
@@ -4951,7 +6798,7 @@
       </w:pPr>
     </w:lvl>
   </w:abstractNum>
-  <w:abstractNum w:abstractNumId="14" w15:restartNumberingAfterBreak="0">
+  <w:abstractNum w:abstractNumId="15">
     <w:nsid w:val="700F36FF"/>
     <w:multiLevelType w:val="hybridMultilevel"/>
     <w:tmpl w:val="416A0A10"/>
@@ -5040,7 +6887,7 @@
       </w:pPr>
     </w:lvl>
   </w:abstractNum>
-  <w:abstractNum w:abstractNumId="15" w15:restartNumberingAfterBreak="0">
+  <w:abstractNum w:abstractNumId="16">
     <w:nsid w:val="733E53A5"/>
     <w:multiLevelType w:val="hybridMultilevel"/>
     <w:tmpl w:val="1F324924"/>
@@ -5153,7 +7000,7 @@
       </w:rPr>
     </w:lvl>
   </w:abstractNum>
-  <w:abstractNum w:abstractNumId="16" w15:restartNumberingAfterBreak="0">
+  <w:abstractNum w:abstractNumId="17">
     <w:nsid w:val="775F403D"/>
     <w:multiLevelType w:val="multilevel"/>
     <w:tmpl w:val="64E87DE0"/>
@@ -5302,62 +7149,65 @@
       </w:rPr>
     </w:lvl>
   </w:abstractNum>
-  <w:num w:numId="1" w16cid:durableId="854072767">
+  <w:num w:numId="1">
+    <w:abstractNumId w:val="11"/>
+  </w:num>
+  <w:num w:numId="2">
+    <w:abstractNumId w:val="13"/>
+  </w:num>
+  <w:num w:numId="3">
+    <w:abstractNumId w:val="5"/>
+  </w:num>
+  <w:num w:numId="4">
+    <w:abstractNumId w:val="7"/>
+  </w:num>
+  <w:num w:numId="5">
+    <w:abstractNumId w:val="3"/>
+  </w:num>
+  <w:num w:numId="6">
+    <w:abstractNumId w:val="6"/>
+  </w:num>
+  <w:num w:numId="7">
+    <w:abstractNumId w:val="8"/>
+  </w:num>
+  <w:num w:numId="8">
+    <w:abstractNumId w:val="14"/>
+  </w:num>
+  <w:num w:numId="9">
+    <w:abstractNumId w:val="1"/>
+  </w:num>
+  <w:num w:numId="10">
+    <w:abstractNumId w:val="16"/>
+  </w:num>
+  <w:num w:numId="11">
+    <w:abstractNumId w:val="4"/>
+  </w:num>
+  <w:num w:numId="12">
+    <w:abstractNumId w:val="17"/>
+  </w:num>
+  <w:num w:numId="13">
+    <w:abstractNumId w:val="2"/>
+  </w:num>
+  <w:num w:numId="14">
     <w:abstractNumId w:val="10"/>
   </w:num>
-  <w:num w:numId="2" w16cid:durableId="450901071">
+  <w:num w:numId="15">
     <w:abstractNumId w:val="12"/>
   </w:num>
-  <w:num w:numId="3" w16cid:durableId="1064333192">
-    <w:abstractNumId w:val="4"/>
-  </w:num>
-  <w:num w:numId="4" w16cid:durableId="1335379151">
-    <w:abstractNumId w:val="6"/>
-  </w:num>
-  <w:num w:numId="5" w16cid:durableId="1105273662">
-    <w:abstractNumId w:val="2"/>
-  </w:num>
-  <w:num w:numId="6" w16cid:durableId="1793595907">
-    <w:abstractNumId w:val="5"/>
-  </w:num>
-  <w:num w:numId="7" w16cid:durableId="2133480054">
-    <w:abstractNumId w:val="7"/>
-  </w:num>
-  <w:num w:numId="8" w16cid:durableId="981735477">
-    <w:abstractNumId w:val="13"/>
-  </w:num>
-  <w:num w:numId="9" w16cid:durableId="935097292">
-    <w:abstractNumId w:val="0"/>
-  </w:num>
-  <w:num w:numId="10" w16cid:durableId="1081366122">
+  <w:num w:numId="16">
     <w:abstractNumId w:val="15"/>
   </w:num>
-  <w:num w:numId="11" w16cid:durableId="1481268724">
-    <w:abstractNumId w:val="3"/>
-  </w:num>
-  <w:num w:numId="12" w16cid:durableId="1331981846">
-    <w:abstractNumId w:val="16"/>
-  </w:num>
-  <w:num w:numId="13" w16cid:durableId="625891934">
-    <w:abstractNumId w:val="1"/>
-  </w:num>
-  <w:num w:numId="14" w16cid:durableId="946619873">
+  <w:num w:numId="17">
     <w:abstractNumId w:val="9"/>
   </w:num>
-  <w:num w:numId="15" w16cid:durableId="65297988">
-    <w:abstractNumId w:val="11"/>
-  </w:num>
-  <w:num w:numId="16" w16cid:durableId="1404372622">
-    <w:abstractNumId w:val="14"/>
-  </w:num>
-  <w:num w:numId="17" w16cid:durableId="1686980385">
-    <w:abstractNumId w:val="8"/>
+  <w:num w:numId="18">
+    <w:abstractNumId w:val="0"/>
   </w:num>
 </w:numbering>
 </file>
 
 <file path=word/styles.xml><?xml version="1.0" encoding="utf-8"?>
-<w:styles xmlns:mc="http://schemas.openxmlformats.org/markup-compatibility/2006" xmlns:r="http://schemas.openxmlformats.org/officeDocument/2006/relationships" xmlns:w="http://schemas.openxmlformats.org/wordprocessingml/2006/main" xmlns:w14="http://schemas.microsoft.com/office/word/2010/wordml" xmlns:w15="http://schemas.microsoft.com/office/word/2012/wordml" xmlns:w16cex="http://schemas.microsoft.com/office/word/2018/wordml/cex" xmlns:w16cid="http://schemas.microsoft.com/office/word/2016/wordml/cid" xmlns:w16="http://schemas.microsoft.com/office/word/2018/wordml" xmlns:w16du="http://schemas.microsoft.com/office/word/2023/wordml/word16du" xmlns:w16sdtdh="http://schemas.microsoft.com/office/word/2020/wordml/sdtdatahash" xmlns:w16sdtfl="http://schemas.microsoft.com/office/word/2024/wordml/sdtformatlock" xmlns:w16se="http://schemas.microsoft.com/office/word/2015/wordml/symex" mc:Ignorable="w14 w15 w16se w16cid w16 w16cex w16sdtdh w16sdtfl w16du">
+<w:styles xmlns:mc="http://schemas.openxmlformats.org/markup-compatibility/2006" xmlns:r="http://schemas.openxmlformats.org/officeDocument/2006/relationships" xmlns:w="http://schemas.openxmlformats.org/wordprocessingml/2006/main" xmlns:w14="http://schemas.microsoft.com/office/word/2010/wordml" xmlns:w15="http://schemas.microsoft.com/office/word/2012/wordml" mc:Ignorable="w14 w15">
   <w:docDefaults>
     <w:rPrDefault>
       <w:rPr>
@@ -5373,7 +7223,7 @@
       </w:pPr>
     </w:pPrDefault>
   </w:docDefaults>
-  <w:latentStyles w:defLockedState="0" w:defUIPriority="99" w:defSemiHidden="0" w:defUnhideWhenUsed="0" w:defQFormat="0" w:count="376">
+  <w:latentStyles w:defLockedState="0" w:defUIPriority="99" w:defSemiHidden="0" w:defUnhideWhenUsed="0" w:defQFormat="0" w:count="371">
     <w:lsdException w:name="Normal" w:uiPriority="0" w:qFormat="1"/>
     <w:lsdException w:name="heading 1" w:uiPriority="9" w:qFormat="1"/>
     <w:lsdException w:name="heading 2" w:semiHidden="1" w:uiPriority="9" w:unhideWhenUsed="1" w:qFormat="1"/>
@@ -5440,7 +7290,7 @@
     <w:lsdException w:name="Closing" w:semiHidden="1" w:unhideWhenUsed="1"/>
     <w:lsdException w:name="Signature" w:semiHidden="1" w:unhideWhenUsed="1"/>
     <w:lsdException w:name="Default Paragraph Font" w:semiHidden="1" w:uiPriority="1" w:unhideWhenUsed="1"/>
-    <w:lsdException w:name="Body Text" w:semiHidden="1" w:unhideWhenUsed="1"/>
+    <w:lsdException w:name="Body Text" w:semiHidden="1" w:uiPriority="0" w:unhideWhenUsed="1" w:qFormat="1"/>
     <w:lsdException w:name="Body Text Indent" w:semiHidden="1" w:unhideWhenUsed="1"/>
     <w:lsdException w:name="List Continue" w:semiHidden="1" w:unhideWhenUsed="1"/>
     <w:lsdException w:name="List Continue 2" w:semiHidden="1" w:unhideWhenUsed="1"/>
@@ -5458,7 +7308,7 @@
     <w:lsdException w:name="Body Text 3" w:semiHidden="1" w:unhideWhenUsed="1"/>
     <w:lsdException w:name="Body Text Indent 2" w:semiHidden="1" w:unhideWhenUsed="1"/>
     <w:lsdException w:name="Body Text Indent 3" w:semiHidden="1" w:unhideWhenUsed="1"/>
-    <w:lsdException w:name="Block Text" w:semiHidden="1" w:unhideWhenUsed="1"/>
+    <w:lsdException w:name="Block Text" w:semiHidden="1" w:uiPriority="9" w:unhideWhenUsed="1" w:qFormat="1"/>
     <w:lsdException w:name="Hyperlink" w:semiHidden="1" w:unhideWhenUsed="1"/>
     <w:lsdException w:name="FollowedHyperlink" w:semiHidden="1" w:unhideWhenUsed="1"/>
     <w:lsdException w:name="Strong" w:uiPriority="22" w:qFormat="1"/>
@@ -5745,11 +7595,6 @@
     <w:lsdException w:name="List Table 5 Dark Accent 6" w:uiPriority="50"/>
     <w:lsdException w:name="List Table 6 Colorful Accent 6" w:uiPriority="51"/>
     <w:lsdException w:name="List Table 7 Colorful Accent 6" w:uiPriority="52"/>
-    <w:lsdException w:name="Mention" w:semiHidden="1" w:unhideWhenUsed="1"/>
-    <w:lsdException w:name="Smart Hyperlink" w:semiHidden="1" w:unhideWhenUsed="1"/>
-    <w:lsdException w:name="Hashtag" w:semiHidden="1" w:unhideWhenUsed="1"/>
-    <w:lsdException w:name="Unresolved Mention" w:semiHidden="1" w:unhideWhenUsed="1"/>
-    <w:lsdException w:name="Smart Link" w:semiHidden="1" w:unhideWhenUsed="1"/>
   </w:latentStyles>
   <w:style w:type="paragraph" w:default="1" w:styleId="Normal">
     <w:name w:val="Normal"/>
@@ -5762,7 +7607,50 @@
       <w:rFonts w:ascii="Times New Roman" w:eastAsia="Times New Roman" w:hAnsi="Times New Roman" w:cs="Times New Roman"/>
       <w:sz w:val="24"/>
       <w:szCs w:val="24"/>
-      <w:lang w:val="en-VN"/>
+    </w:rPr>
+  </w:style>
+  <w:style w:type="paragraph" w:styleId="Heading1">
+    <w:name w:val="heading 1"/>
+    <w:basedOn w:val="Normal"/>
+    <w:next w:val="Normal"/>
+    <w:link w:val="Heading1Char"/>
+    <w:uiPriority w:val="9"/>
+    <w:qFormat/>
+    <w:rsid w:val="00095D1C"/>
+    <w:pPr>
+      <w:keepNext/>
+      <w:keepLines/>
+      <w:spacing w:before="240"/>
+      <w:outlineLvl w:val="0"/>
+    </w:pPr>
+    <w:rPr>
+      <w:rFonts w:asciiTheme="majorHAnsi" w:eastAsiaTheme="majorEastAsia" w:hAnsiTheme="majorHAnsi" w:cstheme="majorBidi"/>
+      <w:color w:val="2E74B5" w:themeColor="accent1" w:themeShade="BF"/>
+      <w:sz w:val="32"/>
+      <w:szCs w:val="32"/>
+    </w:rPr>
+  </w:style>
+  <w:style w:type="paragraph" w:styleId="Heading2">
+    <w:name w:val="heading 2"/>
+    <w:basedOn w:val="Normal"/>
+    <w:next w:val="Normal"/>
+    <w:link w:val="Heading2Char"/>
+    <w:uiPriority w:val="9"/>
+    <w:semiHidden/>
+    <w:unhideWhenUsed/>
+    <w:qFormat/>
+    <w:rsid w:val="00095D1C"/>
+    <w:pPr>
+      <w:keepNext/>
+      <w:keepLines/>
+      <w:spacing w:before="40"/>
+      <w:outlineLvl w:val="1"/>
+    </w:pPr>
+    <w:rPr>
+      <w:rFonts w:asciiTheme="majorHAnsi" w:eastAsiaTheme="majorEastAsia" w:hAnsiTheme="majorHAnsi" w:cstheme="majorBidi"/>
+      <w:color w:val="2E74B5" w:themeColor="accent1" w:themeShade="BF"/>
+      <w:sz w:val="26"/>
+      <w:szCs w:val="26"/>
     </w:rPr>
   </w:style>
   <w:style w:type="paragraph" w:styleId="Heading3">
@@ -5827,7 +7715,6 @@
     </w:pPr>
     <w:rPr>
       <w:szCs w:val="20"/>
-      <w:lang w:val="en-US"/>
     </w:rPr>
   </w:style>
   <w:style w:type="character" w:customStyle="1" w:styleId="HeaderChar">
@@ -5860,7 +7747,6 @@
     </w:pPr>
     <w:rPr>
       <w:szCs w:val="20"/>
-      <w:lang w:val="en-US"/>
     </w:rPr>
   </w:style>
   <w:style w:type="character" w:customStyle="1" w:styleId="FooterChar">
@@ -5885,9 +7771,6 @@
     <w:pPr>
       <w:spacing w:before="100" w:beforeAutospacing="1" w:after="100" w:afterAutospacing="1"/>
     </w:pPr>
-    <w:rPr>
-      <w:lang w:val="en-US"/>
-    </w:rPr>
   </w:style>
   <w:style w:type="table" w:styleId="TableGrid">
     <w:name w:val="Table Grid"/>
@@ -5898,6 +7781,7 @@
       <w:spacing w:after="0" w:line="240" w:lineRule="auto"/>
     </w:pPr>
     <w:tblPr>
+      <w:tblInd w:w="0" w:type="dxa"/>
       <w:tblBorders>
         <w:top w:val="single" w:sz="4" w:space="0" w:color="auto"/>
         <w:left w:val="single" w:sz="4" w:space="0" w:color="auto"/>
@@ -5906,6 +7790,12 @@
         <w:insideH w:val="single" w:sz="4" w:space="0" w:color="auto"/>
         <w:insideV w:val="single" w:sz="4" w:space="0" w:color="auto"/>
       </w:tblBorders>
+      <w:tblCellMar>
+        <w:top w:w="0" w:type="dxa"/>
+        <w:left w:w="108" w:type="dxa"/>
+        <w:bottom w:w="0" w:type="dxa"/>
+        <w:right w:w="108" w:type="dxa"/>
+      </w:tblCellMar>
     </w:tblPr>
   </w:style>
   <w:style w:type="table" w:styleId="TableSubtle2">
@@ -5921,10 +7811,17 @@
       <w:szCs w:val="20"/>
     </w:rPr>
     <w:tblPr>
+      <w:tblInd w:w="0" w:type="dxa"/>
       <w:tblBorders>
         <w:left w:val="single" w:sz="6" w:space="0" w:color="000000"/>
         <w:right w:val="single" w:sz="6" w:space="0" w:color="000000"/>
       </w:tblBorders>
+      <w:tblCellMar>
+        <w:top w:w="0" w:type="dxa"/>
+        <w:left w:w="108" w:type="dxa"/>
+        <w:bottom w:w="0" w:type="dxa"/>
+        <w:right w:w="108" w:type="dxa"/>
+      </w:tblCellMar>
     </w:tblPr>
     <w:tblStylePr w:type="firstRow">
       <w:tblPr/>
@@ -6009,7 +7906,6 @@
     </w:pPr>
     <w:rPr>
       <w:szCs w:val="20"/>
-      <w:lang w:val="en-US"/>
     </w:rPr>
   </w:style>
   <w:style w:type="table" w:customStyle="1" w:styleId="TableGrid0">
@@ -6042,7 +7938,6 @@
       <w:bCs/>
       <w:sz w:val="27"/>
       <w:szCs w:val="27"/>
-      <w:lang w:val="en-VN"/>
     </w:rPr>
   </w:style>
   <w:style w:type="character" w:styleId="Strong">
@@ -6075,6 +7970,146 @@
     <w:name w:val="mbin"/>
     <w:basedOn w:val="DefaultParagraphFont"/>
     <w:rsid w:val="00041309"/>
+  </w:style>
+  <w:style w:type="character" w:customStyle="1" w:styleId="Heading1Char">
+    <w:name w:val="Heading 1 Char"/>
+    <w:basedOn w:val="DefaultParagraphFont"/>
+    <w:link w:val="Heading1"/>
+    <w:uiPriority w:val="9"/>
+    <w:rsid w:val="00095D1C"/>
+    <w:rPr>
+      <w:rFonts w:asciiTheme="majorHAnsi" w:eastAsiaTheme="majorEastAsia" w:hAnsiTheme="majorHAnsi" w:cstheme="majorBidi"/>
+      <w:color w:val="2E74B5" w:themeColor="accent1" w:themeShade="BF"/>
+      <w:sz w:val="32"/>
+      <w:szCs w:val="32"/>
+    </w:rPr>
+  </w:style>
+  <w:style w:type="character" w:customStyle="1" w:styleId="Heading2Char">
+    <w:name w:val="Heading 2 Char"/>
+    <w:basedOn w:val="DefaultParagraphFont"/>
+    <w:link w:val="Heading2"/>
+    <w:uiPriority w:val="9"/>
+    <w:semiHidden/>
+    <w:rsid w:val="00095D1C"/>
+    <w:rPr>
+      <w:rFonts w:asciiTheme="majorHAnsi" w:eastAsiaTheme="majorEastAsia" w:hAnsiTheme="majorHAnsi" w:cstheme="majorBidi"/>
+      <w:color w:val="2E74B5" w:themeColor="accent1" w:themeShade="BF"/>
+      <w:sz w:val="26"/>
+      <w:szCs w:val="26"/>
+    </w:rPr>
+  </w:style>
+  <w:style w:type="paragraph" w:styleId="BodyText">
+    <w:name w:val="Body Text"/>
+    <w:basedOn w:val="Normal"/>
+    <w:link w:val="BodyTextChar"/>
+    <w:qFormat/>
+    <w:rsid w:val="00095D1C"/>
+    <w:pPr>
+      <w:spacing w:before="180" w:after="180"/>
+    </w:pPr>
+    <w:rPr>
+      <w:rFonts w:asciiTheme="minorHAnsi" w:eastAsiaTheme="minorHAnsi" w:hAnsiTheme="minorHAnsi" w:cstheme="minorBidi"/>
+    </w:rPr>
+  </w:style>
+  <w:style w:type="character" w:customStyle="1" w:styleId="BodyTextChar">
+    <w:name w:val="Body Text Char"/>
+    <w:basedOn w:val="DefaultParagraphFont"/>
+    <w:link w:val="BodyText"/>
+    <w:rsid w:val="00095D1C"/>
+    <w:rPr>
+      <w:sz w:val="24"/>
+      <w:szCs w:val="24"/>
+    </w:rPr>
+  </w:style>
+  <w:style w:type="paragraph" w:customStyle="1" w:styleId="FirstParagraph">
+    <w:name w:val="First Paragraph"/>
+    <w:basedOn w:val="BodyText"/>
+    <w:next w:val="BodyText"/>
+    <w:qFormat/>
+    <w:rsid w:val="00095D1C"/>
+  </w:style>
+  <w:style w:type="paragraph" w:customStyle="1" w:styleId="Compact">
+    <w:name w:val="Compact"/>
+    <w:basedOn w:val="BodyText"/>
+    <w:qFormat/>
+    <w:rsid w:val="00095D1C"/>
+    <w:pPr>
+      <w:spacing w:before="36" w:after="36"/>
+    </w:pPr>
+  </w:style>
+  <w:style w:type="paragraph" w:styleId="BlockText">
+    <w:name w:val="Block Text"/>
+    <w:basedOn w:val="BodyText"/>
+    <w:next w:val="BodyText"/>
+    <w:uiPriority w:val="9"/>
+    <w:unhideWhenUsed/>
+    <w:qFormat/>
+    <w:rsid w:val="00095D1C"/>
+    <w:pPr>
+      <w:spacing w:before="100" w:after="100"/>
+      <w:ind w:left="480" w:right="480"/>
+    </w:pPr>
+  </w:style>
+  <w:style w:type="table" w:customStyle="1" w:styleId="Table">
+    <w:name w:val="Table"/>
+    <w:semiHidden/>
+    <w:unhideWhenUsed/>
+    <w:qFormat/>
+    <w:rsid w:val="00095D1C"/>
+    <w:pPr>
+      <w:spacing w:after="200" w:line="240" w:lineRule="auto"/>
+    </w:pPr>
+    <w:rPr>
+      <w:sz w:val="24"/>
+      <w:szCs w:val="24"/>
+    </w:rPr>
+    <w:tblPr>
+      <w:tblInd w:w="0" w:type="dxa"/>
+      <w:tblCellMar>
+        <w:top w:w="0" w:type="dxa"/>
+        <w:left w:w="108" w:type="dxa"/>
+        <w:bottom w:w="0" w:type="dxa"/>
+        <w:right w:w="108" w:type="dxa"/>
+      </w:tblCellMar>
+    </w:tblPr>
+    <w:tblStylePr w:type="firstRow">
+      <w:tblPr>
+        <w:jc w:val="left"/>
+      </w:tblPr>
+      <w:trPr>
+        <w:jc w:val="left"/>
+      </w:trPr>
+      <w:tcPr>
+        <w:tcBorders>
+          <w:bottom w:val="single" w:sz="0" w:space="0" w:color="auto"/>
+        </w:tcBorders>
+        <w:vAlign w:val="bottom"/>
+      </w:tcPr>
+    </w:tblStylePr>
+  </w:style>
+  <w:style w:type="character" w:customStyle="1" w:styleId="VerbatimChar">
+    <w:name w:val="Verbatim Char"/>
+    <w:basedOn w:val="DefaultParagraphFont"/>
+    <w:link w:val="SourceCode"/>
+    <w:rsid w:val="00095D1C"/>
+    <w:rPr>
+      <w:rFonts w:ascii="Consolas" w:hAnsi="Consolas"/>
+    </w:rPr>
+  </w:style>
+  <w:style w:type="paragraph" w:customStyle="1" w:styleId="SourceCode">
+    <w:name w:val="Source Code"/>
+    <w:basedOn w:val="Normal"/>
+    <w:link w:val="VerbatimChar"/>
+    <w:rsid w:val="00095D1C"/>
+    <w:pPr>
+      <w:wordWrap w:val="0"/>
+      <w:spacing w:after="200"/>
+    </w:pPr>
+    <w:rPr>
+      <w:rFonts w:ascii="Consolas" w:eastAsiaTheme="minorHAnsi" w:hAnsi="Consolas" w:cstheme="minorBidi"/>
+      <w:sz w:val="22"/>
+      <w:szCs w:val="22"/>
+    </w:rPr>
   </w:style>
 </w:styles>
 </file>
@@ -6345,7 +8380,7 @@
 </file>
 
 <file path=customXml/itemProps1.xml><?xml version="1.0" encoding="utf-8"?>
-<ds:datastoreItem xmlns:ds="http://schemas.openxmlformats.org/officeDocument/2006/customXml" ds:itemID="{D5D6DDE2-C8D9-F84B-B7B9-6037F7DA0401}">
+<ds:datastoreItem xmlns:ds="http://schemas.openxmlformats.org/officeDocument/2006/customXml" ds:itemID="{7A80FD52-8F21-4598-824E-2DC61A6013FD}">
   <ds:schemaRefs>
     <ds:schemaRef ds:uri="http://schemas.openxmlformats.org/officeDocument/2006/bibliography"/>
   </ds:schemaRefs>

</xml_diff>